<commit_message>
fix: atualiza arquivos do currículo em formato DOCX e PDF
</commit_message>
<xml_diff>
--- a/CurricullumZem.docx
+++ b/CurricullumZem.docx
@@ -2,997 +2,1198 @@
 <file path=word/document.xml><?xml version="1.0" encoding="utf-8"?>
 <w:document xmlns:wpc="http://schemas.microsoft.com/office/word/2010/wordprocessingCanvas" xmlns:mo="http://schemas.microsoft.com/office/mac/office/2008/main" xmlns:mc="http://schemas.openxmlformats.org/markup-compatibility/2006" xmlns:mv="urn:schemas-microsoft-com:mac:vml" xmlns:o="urn:schemas-microsoft-com:office:office" xmlns:r="http://schemas.openxmlformats.org/officeDocument/2006/relationships" xmlns:m="http://schemas.openxmlformats.org/officeDocument/2006/math" xmlns:v="urn:schemas-microsoft-com:vml" xmlns:wp14="http://schemas.microsoft.com/office/word/2010/wordprocessingDrawing" xmlns:wp="http://schemas.openxmlformats.org/drawingml/2006/wordprocessingDrawing" xmlns:w10="urn:schemas-microsoft-com:office:word" xmlns:w="http://schemas.openxmlformats.org/wordprocessingml/2006/main" xmlns:w14="http://schemas.microsoft.com/office/word/2010/wordml" xmlns:wpg="http://schemas.microsoft.com/office/word/2010/wordprocessingGroup" xmlns:wpi="http://schemas.microsoft.com/office/word/2010/wordprocessingInk" xmlns:wne="http://schemas.microsoft.com/office/word/2006/wordml" xmlns:wps="http://schemas.microsoft.com/office/word/2010/wordprocessingShape" mc:Ignorable="w14 wp14">
   <w:body>
-    <w:tbl>
-      <w:tblPr>
-        <w:tblW w:type="auto" w:w="0"/>
-        <w:tblLook w:firstColumn="1" w:firstRow="1" w:lastColumn="0" w:lastRow="0" w:noHBand="0" w:noVBand="1" w:val="04A0"/>
-        <w:tblBorders>
-          <w:top w:val="none"/>
-          <w:left w:val="none"/>
-          <w:bottom w:val="none"/>
-          <w:right w:val="none"/>
-          <w:insideH w:val="none"/>
-          <w:insideV w:val="none"/>
-        </w:tblBorders>
-      </w:tblPr>
-      <w:tblGrid>
-        <w:gridCol w:w="7654"/>
-        <w:gridCol w:w="1984"/>
-      </w:tblGrid>
-      <w:tr>
-        <w:tc>
-          <w:tcPr>
-            <w:tcW w:type="dxa" w:w="5100"/>
-            <w:vAlign w:val="center"/>
-          </w:tcPr>
-          <w:p>
-            <w:pPr>
-              <w:spacing w:after="0"/>
-            </w:pPr>
-            <w:r>
-              <w:rPr>
-                <w:b/>
-                <w:color w:val="1F2A44"/>
-                <w:sz w:val="44"/>
-              </w:rPr>
-              <w:t>MATHEUS LAJARIN ZEM</w:t>
-            </w:r>
-          </w:p>
-          <w:p>
-            <w:pPr>
-              <w:spacing w:after="80"/>
-            </w:pPr>
-            <w:r>
-              <w:rPr>
-                <w:b/>
-                <w:color w:val="2E6BE6"/>
-                <w:sz w:val="22"/>
-              </w:rPr>
-              <w:t>Desenvolvedor Full Stack</w:t>
-            </w:r>
-          </w:p>
-          <w:p>
-            <w:pPr>
-              <w:spacing w:after="0"/>
-            </w:pPr>
-            <w:r>
-              <w:rPr>
-                <w:color w:val="444B57"/>
-                <w:sz w:val="19"/>
-              </w:rPr>
-              <w:t>Piracicaba/SP  |  (19) 99985-1929 (WhatsApp)</w:t>
-            </w:r>
-          </w:p>
-          <w:p>
-            <w:pPr>
-              <w:spacing w:after="0"/>
-            </w:pPr>
-            <w:r>
-              <w:rPr>
-                <w:color w:val="444B57"/>
-                <w:sz w:val="19"/>
-              </w:rPr>
-              <w:t>matheuslajazem@gmail.com</w:t>
-            </w:r>
-          </w:p>
-          <w:p>
-            <w:pPr>
-              <w:spacing w:after="0"/>
-            </w:pPr>
-            <w:r>
-              <w:rPr>
-                <w:color w:val="444B57"/>
-                <w:sz w:val="19"/>
-              </w:rPr>
-              <w:t>linkedin.com/in/matheus-lajarin-zem-17b39b289</w:t>
-            </w:r>
-          </w:p>
-          <w:p>
-            <w:pPr>
-              <w:spacing w:after="0"/>
-            </w:pPr>
-            <w:r>
-              <w:rPr>
-                <w:color w:val="444B57"/>
-                <w:sz w:val="19"/>
-              </w:rPr>
-              <w:t>github.com/MatheusZem12</w:t>
-            </w:r>
-          </w:p>
-        </w:tc>
-        <w:tc>
-          <w:tcPr>
-            <w:tcW w:type="dxa" w:w="5100"/>
-            <w:vAlign w:val="center"/>
-          </w:tcPr>
-          <w:p>
-            <w:pPr>
-              <w:jc w:val="right"/>
-            </w:pPr>
-            <w:r>
-              <w:drawing>
-                <wp:inline xmlns:a="http://schemas.openxmlformats.org/drawingml/2006/main" xmlns:pic="http://schemas.openxmlformats.org/drawingml/2006/picture">
-                  <wp:extent cx="1152000" cy="1375689"/>
-                  <wp:docPr id="1" name="Picture 1"/>
-                  <wp:cNvGraphicFramePr>
-                    <a:graphicFrameLocks noChangeAspect="1"/>
-                  </wp:cNvGraphicFramePr>
-                  <a:graphic>
-                    <a:graphicData uri="http://schemas.openxmlformats.org/drawingml/2006/picture">
-                      <pic:pic>
-                        <pic:nvPicPr>
-                          <pic:cNvPr id="0" name="foto_zem.png"/>
-                          <pic:cNvPicPr/>
-                        </pic:nvPicPr>
-                        <pic:blipFill>
-                          <a:blip r:embed="rId9"/>
-                          <a:stretch>
-                            <a:fillRect/>
-                          </a:stretch>
-                        </pic:blipFill>
-                        <pic:spPr>
-                          <a:xfrm>
-                            <a:off x="0" y="0"/>
-                            <a:ext cx="1152000" cy="1375689"/>
-                          </a:xfrm>
-                          <a:prstGeom prst="rect"/>
-                        </pic:spPr>
-                      </pic:pic>
-                    </a:graphicData>
-                  </a:graphic>
-                </wp:inline>
-              </w:drawing>
-            </w:r>
-          </w:p>
-        </w:tc>
-      </w:tr>
-    </w:tbl>
     <w:p>
       <w:pPr>
-        <w:spacing w:before="200" w:after="60"/>
+        <w:spacing w:before="0" w:after="40" w:line="240" w:lineRule="auto"/>
+        <w:jc w:val="center"/>
+      </w:pPr>
+      <w:r>
+        <w:rPr>
+          <w:b/>
+          <w:color w:val="000000"/>
+          <w:sz w:val="32"/>
+        </w:rPr>
+        <w:t>MATHEUS LAJARIN ZEM</w:t>
+      </w:r>
+    </w:p>
+    <w:p>
+      <w:pPr>
+        <w:spacing w:before="0" w:after="40" w:line="240" w:lineRule="auto"/>
+        <w:jc w:val="center"/>
+      </w:pPr>
+      <w:r>
+        <w:rPr>
+          <w:b/>
+          <w:color w:val="1D4ED8"/>
+          <w:sz w:val="24"/>
+        </w:rPr>
+        <w:t>Desenvolvedor Full Stack Pleno · Java · Spring · Angular</w:t>
+      </w:r>
+    </w:p>
+    <w:p>
+      <w:pPr>
+        <w:spacing w:before="0" w:after="0" w:line="240" w:lineRule="auto"/>
+        <w:jc w:val="center"/>
+      </w:pPr>
+      <w:r>
+        <w:rPr>
+          <w:b w:val="0"/>
+          <w:color w:val="444444"/>
+          <w:sz w:val="22"/>
+        </w:rPr>
+        <w:t>Piracicaba/SP · +55 (19) 99985-1929 (WhatsApp) · matheuslajazem@gmail.com</w:t>
+      </w:r>
+    </w:p>
+    <w:p>
+      <w:pPr>
+        <w:spacing w:before="0" w:after="0" w:line="240" w:lineRule="auto"/>
+        <w:jc w:val="center"/>
+      </w:pPr>
+      <w:r>
+        <w:rPr>
+          <w:b w:val="0"/>
+          <w:color w:val="444444"/>
+          <w:sz w:val="22"/>
+        </w:rPr>
+        <w:t>linkedin.com/in/matheus-lajarin-zem-17b39b289 · github.com/MatheusZem12</w:t>
+      </w:r>
+    </w:p>
+    <w:p>
+      <w:pPr>
+        <w:spacing w:before="280" w:after="80" w:line="240" w:lineRule="auto"/>
+        <w:jc w:val="left"/>
         <w:pBdr>
-          <w:bottom w:val="single" w:sz="6" w:space="2" w:color="2E6BE6"/>
+          <w:bottom w:val="single" w:sz="6" w:space="2" w:color="1D4ED8"/>
         </w:pBdr>
       </w:pPr>
       <w:r>
         <w:rPr>
-          <w:rFonts w:ascii="Calibri" w:hAnsi="Calibri"/>
           <w:b/>
-          <w:color w:val="1F2A44"/>
-          <w:sz w:val="23"/>
+          <w:color w:val="1D4ED8"/>
+          <w:sz w:val="24"/>
         </w:rPr>
         <w:t>RESUMO PROFISSIONAL</w:t>
       </w:r>
     </w:p>
     <w:p>
       <w:pPr>
-        <w:spacing w:after="40"/>
+        <w:spacing w:after="80"/>
       </w:pPr>
       <w:r>
-        <w:t>Desenvolvedor Full Stack com atuação de ponta a ponta: modelagem de dados, APIs, frontend, infraestrutura e deploy em produção. Sou estudante de Engenharia da Computação e tenho experiência tanto em produtos corporativos de grande porte quanto em projetos próprios completos.</w:t>
+        <w:rPr>
+          <w:b w:val="0"/>
+          <w:sz w:val="24"/>
+        </w:rPr>
+        <w:t>Desenvolvedor Full Stack com atuação de ponta a ponta: modelagem de dados, APIs, microsserviços, frontend, CI/CD e operação em produção. Experiência corporativa no ecossistema agroindustrial (ERP TOTVS PIMS), em duas linhas de produto em microsserviços (Spring Boot 3, Spring Cloud Gateway, Eureka, OpenFeign) com integrações críticas — SAP, TOTVS Protheus, plataformas B2B e hardware industrial — sobre bancos Oracle, SQL Server e PostgreSQL.</w:t>
       </w:r>
     </w:p>
     <w:p>
       <w:pPr>
-        <w:spacing w:after="40"/>
+        <w:spacing w:after="80"/>
       </w:pPr>
       <w:r>
-        <w:t>Trabalho com foco em qualidade e boas práticas de engenharia, como versionamento em fluxo DEV/HMG/PRD, migrações de banco controladas, pipelines de CI/CD, ambiente de homologação antes da produção e segurança da aplicação (autenticação JWT e criptografia de dados sensíveis). Tenho flexibilidade com tecnologias e escolho a ferramenta adequada para cada caso: tenho base sólida em Java/Spring, uso Python em cenários de produtividade, dados e automação, e Go quando preciso de mais performance e simplicidade.</w:t>
+        <w:rPr>
+          <w:b w:val="0"/>
+          <w:sz w:val="24"/>
+        </w:rPr>
+        <w:t xml:space="preserve">Em paralelo, projeto, construo e </w:t>
+      </w:r>
+      <w:r>
+        <w:rPr>
+          <w:b/>
+          <w:sz w:val="24"/>
+        </w:rPr>
+        <w:t>opero produtos próprios em produção</w:t>
+      </w:r>
+      <w:r>
+        <w:rPr>
+          <w:b w:val="0"/>
+          <w:sz w:val="24"/>
+        </w:rPr>
+        <w:t>: uma VPS Linux hospeda três backends Spring Boot em Docker, com pipeline GitHub Actions → GHCR → Watchtower (deploy pull-based), borda via Cloudflare Tunnel e ambientes DEV/HMG/PRD reais. Foco em engenharia verificável: migrações Flyway versionadas, testes com JUnit, Testcontainers, Playwright e Vitest, e segurança com JWT, OAuth2, 2FA, criptografia AES-GCM e rate limiting.</w:t>
       </w:r>
     </w:p>
     <w:p>
       <w:pPr>
-        <w:spacing w:after="40"/>
+        <w:spacing w:after="80"/>
       </w:pPr>
       <w:r>
-        <w:t>Uso assistentes de IA (KIMI e Claude) no dia a dia de desenvolvimento para acelerar codificação, code review, depuração e decisões de arquitetura, sempre validando os resultados.</w:t>
+        <w:rPr>
+          <w:b w:val="0"/>
+          <w:sz w:val="24"/>
+        </w:rPr>
+        <w:t>Conhecimento de mensageria (RabbitMQ) e uso prático de padrões assíncronos: eventos de domínio, filas de tarefas com polling, jobs agendados e threads virtuais. Uso assistentes de IA (Claude e KIMI) como par de programação — codificação, revisão, depuração e arquitetura — sempre validando os resultados.</w:t>
       </w:r>
     </w:p>
     <w:p>
       <w:pPr>
-        <w:spacing w:before="200" w:after="60"/>
+        <w:spacing w:before="280" w:after="80" w:line="240" w:lineRule="auto"/>
+        <w:jc w:val="left"/>
         <w:pBdr>
-          <w:bottom w:val="single" w:sz="6" w:space="2" w:color="2E6BE6"/>
+          <w:bottom w:val="single" w:sz="6" w:space="2" w:color="1D4ED8"/>
         </w:pBdr>
       </w:pPr>
       <w:r>
         <w:rPr>
-          <w:rFonts w:ascii="Calibri" w:hAnsi="Calibri"/>
           <w:b/>
-          <w:color w:val="1F2A44"/>
-          <w:sz w:val="23"/>
+          <w:color w:val="1D4ED8"/>
+          <w:sz w:val="24"/>
         </w:rPr>
-        <w:t>EXPERIÊNCIAS PROFISSIONAIS</w:t>
+        <w:t>EXPERIÊNCIA PROFISSIONAL</w:t>
       </w:r>
     </w:p>
     <w:p>
       <w:pPr>
-        <w:spacing w:before="120" w:after="0"/>
+        <w:spacing w:before="200" w:after="40" w:line="240" w:lineRule="auto"/>
+        <w:jc w:val="left"/>
       </w:pPr>
       <w:r>
         <w:rPr>
           <w:b/>
-          <w:color w:val="1F2A44"/>
-          <w:sz w:val="21"/>
+          <w:sz w:val="24"/>
         </w:rPr>
+        <w:t>TOTVS (setor agroindustrial) — Desenvolvedor Full Stack Pleno (PJ)</w:t>
       </w:r>
       <w:r>
         <w:rPr>
           <w:i/>
-          <w:color w:val="6B7280"/>
-          <w:sz w:val="19"/>
+          <w:color w:val="444444"/>
+          <w:sz w:val="22"/>
         </w:rPr>
-      </w:r>
-      <w:r>
-        <w:rPr>
-          <w:b/>
-          <w:color w:val="1F2A44"/>
-          <w:sz w:val="21"/>
-        </w:rPr>
-      </w:r>
-      <w:r>
-        <w:rPr>
-          <w:b/>
-          <w:color w:val="1F2A44"/>
-          <w:sz w:val="21"/>
-        </w:rPr>
-        <w:t>TOTVS — Desenvolvedor Full Stack Pleno (PJ)   nov/2024 – atual</w:t>
+        <w:t xml:space="preserve">   nov/2024 – atual</w:t>
       </w:r>
     </w:p>
     <w:p>
       <w:pPr>
-        <w:spacing w:after="40"/>
+        <w:spacing w:after="80"/>
       </w:pPr>
       <w:r>
-        <w:t>Desenvolvimento e manutenção de plataformas de gestão para o setor agroindustrial em arquitetura de microsserviços (Spring Boot, Spring Cloud Gateway e Eureka) com portais web em Angular e PostgreSQL.</w:t>
+        <w:rPr>
+          <w:b w:val="0"/>
+          <w:sz w:val="24"/>
+        </w:rPr>
+        <w:t>Desenvolvimento e manutenção de plataformas de gestão agroindustrial — custos, fluxo de caixa, materiais, fornecedores, pesagem/balança, produção industrial e otimização de colheita — em arquitetura de microsserviços, integradas ao ERP PIMS.</w:t>
       </w:r>
     </w:p>
     <w:p>
       <w:pPr>
         <w:pStyle w:val="ListBullet"/>
-        <w:spacing w:after="20"/>
-        <w:ind w:left="283"/>
+        <w:spacing w:line="360" w:lineRule="auto" w:after="40"/>
+        <w:ind w:left="425"/>
+        <w:jc w:val="both"/>
       </w:pPr>
       <w:r>
         <w:rPr>
           <w:b/>
-          <w:color w:val="1F2A44"/>
+          <w:sz w:val="24"/>
         </w:rPr>
         <w:t xml:space="preserve">Microsserviços: </w:t>
       </w:r>
       <w:r>
         <w:rPr>
-          <w:color w:val="444B57"/>
+          <w:b w:val="0"/>
+          <w:sz w:val="24"/>
         </w:rPr>
-        <w:t>Atuação em sistemas compostos por dezenas de microsserviços voltados à gestão de custos, fluxo de caixa, materiais, fornecedores, pesagem/balança e processos produtivos.</w:t>
+        <w:t>atuação em duas linhas de produto que somam ~30 serviços Spring Boot 3 (Java 17/21), com dois padrões de gateway — Spring Cloud Gateway com rotas estáticas + OpenFeign numa linha, e Gateway + Netflix Eureka (service discovery, 13 rotas) na outra; observabilidade com Actuator e Prometheus.</w:t>
       </w:r>
     </w:p>
     <w:p>
       <w:pPr>
         <w:pStyle w:val="ListBullet"/>
-        <w:spacing w:after="20"/>
-        <w:ind w:left="283"/>
+        <w:spacing w:line="360" w:lineRule="auto" w:after="40"/>
+        <w:ind w:left="425"/>
+        <w:jc w:val="both"/>
       </w:pPr>
       <w:r>
         <w:rPr>
           <w:b/>
-          <w:color w:val="1F2A44"/>
+          <w:sz w:val="24"/>
         </w:rPr>
-        <w:t xml:space="preserve">APIs &amp; integrações: </w:t>
+        <w:t xml:space="preserve">Integrações críticas: </w:t>
       </w:r>
       <w:r>
         <w:rPr>
-          <w:color w:val="444B57"/>
+          <w:b w:val="0"/>
+          <w:sz w:val="24"/>
         </w:rPr>
-        <w:t>Desenvolvimento de APIs REST, integrações entre serviços e interfaces de integração com sistemas externos e ERPs.</w:t>
+        <w:t>conector SAP (contratos, notas fiscais, pesagens, provisões e custos), interfaces PIMS ↔ TOTVS Protheus, plataforma de compras CIB2B, helpdesk Milvus (API REST + RPA com Selenium) e leitura de balança industrial Toledo via socket TCP.</w:t>
       </w:r>
     </w:p>
     <w:p>
       <w:pPr>
         <w:pStyle w:val="ListBullet"/>
-        <w:spacing w:after="20"/>
-        <w:ind w:left="283"/>
+        <w:spacing w:line="360" w:lineRule="auto" w:after="40"/>
+        <w:ind w:left="425"/>
+        <w:jc w:val="both"/>
       </w:pPr>
       <w:r>
         <w:rPr>
           <w:b/>
-          <w:color w:val="1F2A44"/>
+          <w:sz w:val="24"/>
         </w:rPr>
-        <w:t xml:space="preserve">Banco de dados: </w:t>
+        <w:t xml:space="preserve">Multi-banco: </w:t>
       </w:r>
       <w:r>
         <w:rPr>
-          <w:color w:val="444B57"/>
+          <w:b w:val="0"/>
+          <w:sz w:val="24"/>
         </w:rPr>
-        <w:t>Modelagem, criação de tabelas e otimização de queries PostgreSQL para ganho de performance e estabilidade nas operações.</w:t>
+        <w:t>PostgreSQL nos produtos, Oracle no ERP PIMS e SQL Server no PIMS Multicultivo — modelagem, otimização de queries e jobs de sincronização (@Scheduled) entre ERP e produtos.</w:t>
       </w:r>
     </w:p>
     <w:p>
       <w:pPr>
         <w:pStyle w:val="ListBullet"/>
-        <w:spacing w:after="20"/>
-        <w:ind w:left="283"/>
+        <w:spacing w:line="360" w:lineRule="auto" w:after="40"/>
+        <w:ind w:left="425"/>
+        <w:jc w:val="both"/>
       </w:pPr>
       <w:r>
         <w:rPr>
           <w:b/>
-          <w:color w:val="1F2A44"/>
+          <w:sz w:val="24"/>
         </w:rPr>
-        <w:t xml:space="preserve">Qualidade &amp; versionamento: </w:t>
+        <w:t xml:space="preserve">Modernização de legado: </w:t>
       </w:r>
       <w:r>
         <w:rPr>
-          <w:color w:val="444B57"/>
+          <w:b w:val="0"/>
+          <w:sz w:val="24"/>
         </w:rPr>
-        <w:t>Depuração e ajuste de serviços, APIs e integrações, garantindo estabilidade no ambiente do cliente; versionamento com Git em fluxo DEV / HMG / PRD.</w:t>
+        <w:t>reescrita de integrações Java 8 / Spring Boot 2 (WAR em Tomcat) para Java 17/21 / Spring Boot 3, e participação na evolução de produto legado (Angular 8 → Angular 19).</w:t>
       </w:r>
     </w:p>
     <w:p>
       <w:pPr>
-        <w:spacing w:before="120" w:after="0"/>
+        <w:pStyle w:val="ListBullet"/>
+        <w:spacing w:line="360" w:lineRule="auto" w:after="40"/>
+        <w:ind w:left="425"/>
+        <w:jc w:val="both"/>
       </w:pPr>
       <w:r>
         <w:rPr>
           <w:b/>
-          <w:color w:val="1F2A44"/>
-          <w:sz w:val="21"/>
+          <w:sz w:val="24"/>
+        </w:rPr>
+        <w:t xml:space="preserve">Frontend: </w:t>
+      </w:r>
+      <w:r>
+        <w:rPr>
+          <w:b w:val="0"/>
+          <w:sz w:val="24"/>
+        </w:rPr>
+        <w:t>portais Angular 17–20 (PrimeNG, TailwindCSS, ECharts/Chart.js, i18n), incluindo Angular 20 com SSR; manutenção de produto de gestão pecuária em Python/Django REST + Vue 3 com suporte simultâneo a Oracle, SQL Server e PostgreSQL.</w:t>
+      </w:r>
+    </w:p>
+    <w:p>
+      <w:pPr>
+        <w:pStyle w:val="ListBullet"/>
+        <w:spacing w:line="360" w:lineRule="auto" w:after="40"/>
+        <w:ind w:left="425"/>
+        <w:jc w:val="both"/>
+      </w:pPr>
+      <w:r>
+        <w:rPr>
+          <w:b/>
+          <w:sz w:val="24"/>
+        </w:rPr>
+        <w:t xml:space="preserve">CI/CD: </w:t>
+      </w:r>
+      <w:r>
+        <w:rPr>
+          <w:b w:val="0"/>
+          <w:sz w:val="24"/>
+        </w:rPr>
+        <w:t>pipelines GitHub Actions com deploy de portal em Azure Static Web Apps em 3 ambientes; fluxo Git DEV/HMG/PRD.</w:t>
+      </w:r>
+    </w:p>
+    <w:p>
+      <w:pPr>
+        <w:spacing w:before="200" w:after="40" w:line="240" w:lineRule="auto"/>
+        <w:jc w:val="left"/>
+      </w:pPr>
+      <w:r>
+        <w:rPr>
+          <w:b/>
+          <w:sz w:val="24"/>
         </w:rPr>
         <w:t>CNH Industrial — Estágio em Gestão de Projetos</w:t>
       </w:r>
       <w:r>
         <w:rPr>
           <w:i/>
-          <w:color w:val="6B7280"/>
-          <w:sz w:val="19"/>
+          <w:color w:val="444444"/>
+          <w:sz w:val="22"/>
         </w:rPr>
         <w:t xml:space="preserve">   jun/2022 – jun/2024</w:t>
       </w:r>
     </w:p>
     <w:p>
       <w:pPr>
-        <w:spacing w:after="40"/>
+        <w:spacing w:after="80"/>
       </w:pPr>
       <w:r>
-        <w:t>Gestão de peças em projetos, do cadastro à relação com fornecedores. Desenvolvimento de tabelas responsivas, macros e tabelas dinâmicas no Excel para otimizar controle e análise de dados.</w:t>
+        <w:rPr>
+          <w:b w:val="0"/>
+          <w:sz w:val="24"/>
+        </w:rPr>
+        <w:t>Gestão de peças em projetos, do cadastro à relação com fornecedores; automação de controle e análise de dados com macros e tabelas dinâmicas.</w:t>
       </w:r>
     </w:p>
     <w:p>
       <w:pPr>
-        <w:spacing w:before="120" w:after="0"/>
+        <w:spacing w:before="200" w:after="40" w:line="240" w:lineRule="auto"/>
+        <w:jc w:val="left"/>
       </w:pPr>
       <w:r>
         <w:rPr>
           <w:b/>
-          <w:color w:val="1F2A44"/>
-          <w:sz w:val="21"/>
+          <w:sz w:val="24"/>
         </w:rPr>
         <w:t>Elring Klinger — Estágio em Kaizen</w:t>
       </w:r>
       <w:r>
         <w:rPr>
           <w:i/>
-          <w:color w:val="6B7280"/>
-          <w:sz w:val="19"/>
+          <w:color w:val="444444"/>
+          <w:sz w:val="22"/>
         </w:rPr>
         <w:t xml:space="preserve">   mar/2022 – mai/2022</w:t>
       </w:r>
     </w:p>
     <w:p>
       <w:pPr>
-        <w:spacing w:after="40"/>
+        <w:spacing w:after="80"/>
       </w:pPr>
       <w:r>
-        <w:t>Acompanhamento de requisições de Kaizen, do conceito à implementação. Desenvolvimento de macros para automatizar a geração de relatórios para diversos setores.</w:t>
+        <w:rPr>
+          <w:b w:val="0"/>
+          <w:sz w:val="24"/>
+        </w:rPr>
+        <w:t>Acompanhamento de requisições Kaizen e automação da geração de relatórios para diversos setores.</w:t>
       </w:r>
     </w:p>
     <w:p>
       <w:pPr>
-        <w:spacing w:before="200" w:after="60"/>
+        <w:spacing w:before="280" w:after="80" w:line="240" w:lineRule="auto"/>
+        <w:jc w:val="left"/>
         <w:pBdr>
-          <w:bottom w:val="single" w:sz="6" w:space="2" w:color="2E6BE6"/>
+          <w:bottom w:val="single" w:sz="6" w:space="2" w:color="1D4ED8"/>
         </w:pBdr>
       </w:pPr>
       <w:r>
         <w:rPr>
-          <w:rFonts w:ascii="Calibri" w:hAnsi="Calibri"/>
           <w:b/>
-          <w:color w:val="1F2A44"/>
-          <w:sz w:val="23"/>
+          <w:color w:val="1D4ED8"/>
+          <w:sz w:val="24"/>
         </w:rPr>
         <w:t>PROJETOS PESSOAIS</w:t>
       </w:r>
     </w:p>
     <w:p>
       <w:pPr>
-        <w:spacing w:after="40"/>
+        <w:spacing w:after="80"/>
       </w:pPr>
       <w:r>
-        <w:t>Aplicações full stack que desenvolvi individualmente, do backend ao frontend, infraestrutura e deploy, utilizando IA (KIMI e Claude em paralelo) como par de programação para arquitetura, implementação e revisão de código.</w:t>
+        <w:rPr>
+          <w:i/>
+          <w:sz w:val="24"/>
+        </w:rPr>
+        <w:t>Produtos completos que concebi, desenvolvi e opero sozinho em produção — backend, frontend, banco, CI/CD e infraestrutura — usando IA (Claude e KIMI) como par de programação.</w:t>
       </w:r>
     </w:p>
     <w:p>
       <w:pPr>
-        <w:pStyle w:val="ListBullet"/>
-        <w:spacing w:after="20"/>
-        <w:ind w:left="283"/>
+        <w:spacing w:before="200" w:after="40" w:line="240" w:lineRule="auto"/>
+        <w:jc w:val="left"/>
       </w:pPr>
       <w:r>
         <w:rPr>
           <w:b/>
-          <w:color w:val="1F2A44"/>
+          <w:sz w:val="24"/>
         </w:rPr>
-        <w:t xml:space="preserve">Finance — </w:t>
-      </w:r>
-      <w:r>
-        <w:rPr>
-          <w:color w:val="444B57"/>
-        </w:rPr>
-        <w:t>Plataforma de gestão financeira pessoal (produto Monevas). Java 21 + Spring Boot, Angular + PrimeNG, PostgreSQL, com CI/CD e deploy em VPS própria — detalhada a seguir.</w:t>
-      </w:r>
-    </w:p>
-    <w:p>
-      <w:pPr>
-        <w:pStyle w:val="ListBullet"/>
-        <w:spacing w:after="20"/>
-        <w:ind w:left="283"/>
-      </w:pPr>
-      <w:r>
-        <w:rPr>
-          <w:b/>
-          <w:color w:val="1F2A44"/>
-        </w:rPr>
-        <w:t xml:space="preserve">Educa — </w:t>
-      </w:r>
-      <w:r>
-        <w:rPr>
-          <w:color w:val="444B57"/>
-        </w:rPr>
-        <w:t>Plataforma educacional. Backend Spring Boot e frontend Angular 21 (PrimeNG, TailwindCSS, Chart.js, editor Quill).</w:t>
-      </w:r>
-    </w:p>
-    <w:p>
-      <w:pPr>
-        <w:pStyle w:val="ListBullet"/>
-        <w:spacing w:after="20"/>
-        <w:ind w:left="283"/>
-      </w:pPr>
-      <w:r>
-        <w:rPr>
-          <w:b/>
-          <w:color w:val="1F2A44"/>
-        </w:rPr>
-        <w:t xml:space="preserve">Monitorame — </w:t>
-      </w:r>
-      <w:r>
-        <w:rPr>
-          <w:color w:val="444B57"/>
-        </w:rPr>
-        <w:t>Monitoramento e localização. Backend Spring Boot, frontend Angular com mapas (Leaflet) e aplicativo mobile em Flutter.</w:t>
-      </w:r>
-    </w:p>
-    <w:p>
-      <w:pPr>
-        <w:pStyle w:val="ListBullet"/>
-        <w:spacing w:after="20"/>
-        <w:ind w:left="283"/>
-      </w:pPr>
-      <w:r>
-        <w:rPr>
-          <w:b/>
-          <w:color w:val="1F2A44"/>
-        </w:rPr>
-        <w:t xml:space="preserve">DB Modeler — </w:t>
-      </w:r>
-      <w:r>
-        <w:rPr>
-          <w:color w:val="444B57"/>
-        </w:rPr>
-        <w:t>Modelador visual de bancos de dados em Go (Gin): engenharia reversa e forward de SQL com geração de DDL, DBML e diagramas Mermaid (ER).</w:t>
-      </w:r>
-    </w:p>
-    <w:p>
-      <w:pPr>
-        <w:pStyle w:val="ListBullet"/>
-        <w:spacing w:after="20"/>
-        <w:ind w:left="283"/>
-      </w:pPr>
-      <w:r>
-        <w:rPr>
-          <w:b/>
-          <w:color w:val="1F2A44"/>
-        </w:rPr>
-        <w:t xml:space="preserve">Device Manager — </w:t>
-      </w:r>
-      <w:r>
-        <w:rPr>
-          <w:color w:val="444B57"/>
-        </w:rPr>
-        <w:t>Gerenciamento e localização de dispositivos. Backend Java 21 + Spring Boot e frontend Flutter multiplataforma.</w:t>
-      </w:r>
-    </w:p>
-    <w:p>
-      <w:pPr>
-        <w:pStyle w:val="ListBullet"/>
-        <w:spacing w:after="20"/>
-        <w:ind w:left="283"/>
-      </w:pPr>
-      <w:r>
-        <w:rPr>
-          <w:b/>
-          <w:color w:val="1F2A44"/>
-        </w:rPr>
-        <w:t xml:space="preserve">Git Manager — </w:t>
-      </w:r>
-      <w:r>
-        <w:rPr>
-          <w:color w:val="444B57"/>
-        </w:rPr>
-        <w:t>Gerenciador local de repositórios Git. Backend Java (Javalin + JGit) e frontend Flutter Desktop.</w:t>
-      </w:r>
-    </w:p>
-    <w:p>
-      <w:pPr>
-        <w:pStyle w:val="ListBullet"/>
-        <w:spacing w:after="20"/>
-        <w:ind w:left="283"/>
-      </w:pPr>
-      <w:r>
-        <w:rPr>
-          <w:b/>
-          <w:color w:val="1F2A44"/>
-        </w:rPr>
-        <w:t xml:space="preserve">Aprenda — </w:t>
-      </w:r>
-      <w:r>
-        <w:rPr>
-          <w:color w:val="444B57"/>
-        </w:rPr>
-        <w:t>Trilha de cursos técnicos próprios (Linux, Docker, Go, Python, SQL/PostgreSQL, Frontend, AWS, Kubernetes, Redes, Segurança, IoT, Java e DevOps).</w:t>
-      </w:r>
-    </w:p>
-    <w:p>
-      <w:pPr>
-        <w:spacing w:before="200" w:after="60"/>
-        <w:pBdr>
-          <w:bottom w:val="single" w:sz="6" w:space="2" w:color="2E6BE6"/>
-        </w:pBdr>
-      </w:pPr>
-      <w:r>
-        <w:rPr>
-          <w:rFonts w:ascii="Calibri" w:hAnsi="Calibri"/>
-          <w:b/>
-          <w:color w:val="1F2A44"/>
-          <w:sz w:val="23"/>
-        </w:rPr>
-        <w:t>EXEMPLO PRÁTICO DE PROJETO PESSOAL</w:t>
-      </w:r>
-    </w:p>
-    <w:p>
-      <w:pPr>
-        <w:spacing w:before="120" w:after="0"/>
-      </w:pPr>
-      <w:r>
-        <w:rPr>
-          <w:b/>
-          <w:color w:val="1F2A44"/>
-          <w:sz w:val="21"/>
-        </w:rPr>
-        <w:t>Finance (Monevas) — Plataforma de gestão financeira pessoal</w:t>
+        <w:t>Monevas — finanças pessoais e análise de investimentos</w:t>
       </w:r>
       <w:r>
         <w:rPr>
           <w:i/>
-          <w:color w:val="6B7280"/>
-          <w:sz w:val="19"/>
+          <w:color w:val="444444"/>
+          <w:sz w:val="22"/>
         </w:rPr>
         <w:t xml:space="preserve">   hmg.monevas.com</w:t>
       </w:r>
     </w:p>
     <w:p>
       <w:pPr>
-        <w:spacing w:after="40"/>
+        <w:pStyle w:val="ListBullet"/>
+        <w:spacing w:line="360" w:lineRule="auto" w:after="40"/>
+        <w:ind w:left="425"/>
+        <w:jc w:val="both"/>
       </w:pPr>
       <w:r>
-        <w:t>Produto completo de finanças pessoais, concebido, desenvolvido e operado integralmente por mim — backend, frontend, banco de dados, CI/CD e infraestrutura própria.</w:t>
+        <w:rPr>
+          <w:b/>
+          <w:sz w:val="24"/>
+        </w:rPr>
+        <w:t xml:space="preserve">Backend: </w:t>
+      </w:r>
+      <w:r>
+        <w:rPr>
+          <w:b w:val="0"/>
+          <w:sz w:val="24"/>
+        </w:rPr>
+        <w:t>Java 21 + Spring Boot em monólito modular Maven com 8 módulos e ~120 migrações Flyway (Hibernate em validate); JWT + 2FA por e-mail, criptografia AES-GCM de dados sensíveis em repouso, rate limiting próprio com trusted proxies e proteções anti-slowloris.</w:t>
       </w:r>
     </w:p>
     <w:p>
       <w:pPr>
         <w:pStyle w:val="ListBullet"/>
-        <w:spacing w:after="20"/>
-        <w:ind w:left="283"/>
+        <w:spacing w:line="360" w:lineRule="auto" w:after="40"/>
+        <w:ind w:left="425"/>
+        <w:jc w:val="both"/>
       </w:pPr>
       <w:r>
         <w:rPr>
           <w:b/>
-          <w:color w:val="1F2A44"/>
+          <w:sz w:val="24"/>
         </w:rPr>
-        <w:t xml:space="preserve">Backend: </w:t>
+        <w:t xml:space="preserve">Ingestão de mercado: </w:t>
       </w:r>
       <w:r>
         <w:rPr>
-          <w:color w:val="444B57"/>
+          <w:b w:val="0"/>
+          <w:sz w:val="24"/>
         </w:rPr>
-        <w:t>Java 21 + Spring Boot 3.3.5 em monólito modular Maven (módulos de auth, usuários, contas/transações bancárias, investimentos, planejamento, relatórios, notificações e IA), expondo APIs REST.</w:t>
+        <w:t>serviço Python (FastAPI) coletando B3, CVM e Yahoo Finance — cotações, proventos, demonstrativos e FIIs — numa base com 8,9 milhões de candles; throttling global e retry com backoff contra rate limit.</w:t>
       </w:r>
     </w:p>
     <w:p>
       <w:pPr>
         <w:pStyle w:val="ListBullet"/>
-        <w:spacing w:after="20"/>
-        <w:ind w:left="283"/>
+        <w:spacing w:line="360" w:lineRule="auto" w:after="40"/>
+        <w:ind w:left="425"/>
+        <w:jc w:val="both"/>
       </w:pPr>
       <w:r>
         <w:rPr>
           <w:b/>
-          <w:color w:val="1F2A44"/>
+          <w:sz w:val="24"/>
+        </w:rPr>
+        <w:t xml:space="preserve">Análise: </w:t>
+      </w:r>
+      <w:r>
+        <w:rPr>
+          <w:b w:val="0"/>
+          <w:sz w:val="24"/>
+        </w:rPr>
+        <w:t>aplicativo desktop nativo (PySide6 + pyqtgraph) em 4 camadas com enforcement por teste; 5 métodos de valuation, screener e score por percentil; autenticação delegada ao backend.</w:t>
+      </w:r>
+    </w:p>
+    <w:p>
+      <w:pPr>
+        <w:pStyle w:val="ListBullet"/>
+        <w:spacing w:line="360" w:lineRule="auto" w:after="40"/>
+        <w:ind w:left="425"/>
+        <w:jc w:val="both"/>
+      </w:pPr>
+      <w:r>
+        <w:rPr>
+          <w:b/>
+          <w:sz w:val="24"/>
         </w:rPr>
         <w:t xml:space="preserve">Frontend: </w:t>
       </w:r>
       <w:r>
         <w:rPr>
-          <w:color w:val="444B57"/>
+          <w:b w:val="0"/>
+          <w:sz w:val="24"/>
         </w:rPr>
-        <w:t>Angular + PrimeNG com internacionalização (pt-BR, inglês e espanhol) e build separado por ambiente.</w:t>
+        <w:t>Angular 21 + PrimeNG, i18n (pt/en/es), testes Vitest como gate de build, deploy Vercel.</w:t>
       </w:r>
     </w:p>
     <w:p>
       <w:pPr>
         <w:pStyle w:val="ListBullet"/>
-        <w:spacing w:after="20"/>
-        <w:ind w:left="283"/>
+        <w:spacing w:line="360" w:lineRule="auto" w:after="40"/>
+        <w:ind w:left="425"/>
+        <w:jc w:val="both"/>
       </w:pPr>
       <w:r>
         <w:rPr>
           <w:b/>
-          <w:color w:val="1F2A44"/>
+          <w:sz w:val="24"/>
         </w:rPr>
-        <w:t xml:space="preserve">Dados: </w:t>
+        <w:t xml:space="preserve">Infra/CI: </w:t>
       </w:r>
       <w:r>
         <w:rPr>
-          <w:color w:val="444B57"/>
+          <w:b w:val="0"/>
+          <w:sz w:val="24"/>
         </w:rPr>
-        <w:t>PostgreSQL com migrações versionadas via Flyway (Hibernate em modo validate, sem auto-DDL), garantindo evolução previsível do schema.</w:t>
+        <w:t>GitHub Actions → GHCR → Watchtower na VPS (deploy pull-based, o GitHub nunca acessa o servidor); Cloudflare Tunnel na borda; homologação real antes da produção.</w:t>
       </w:r>
     </w:p>
     <w:p>
       <w:pPr>
         <w:pStyle w:val="ListBullet"/>
-        <w:spacing w:after="20"/>
-        <w:ind w:left="283"/>
+        <w:spacing w:line="360" w:lineRule="auto" w:after="40"/>
+        <w:ind w:left="425"/>
+        <w:jc w:val="both"/>
       </w:pPr>
       <w:r>
         <w:rPr>
           <w:b/>
-          <w:color w:val="1F2A44"/>
+          <w:sz w:val="24"/>
         </w:rPr>
-        <w:t xml:space="preserve">Segurança: </w:t>
+        <w:t xml:space="preserve">Desafios resolvidos: </w:t>
       </w:r>
       <w:r>
         <w:rPr>
-          <w:color w:val="444B57"/>
+          <w:b w:val="0"/>
+          <w:sz w:val="24"/>
         </w:rPr>
-        <w:t>Spring Security com autenticação JWT (JJWT), papéis/permissões e criptografia de dados sensíveis.</w:t>
+        <w:t>OOMKill (exit 137) da JVM em VPS de 4 GB durante sincronização de preços, resolvido com limites de memória por container e ajuste de MaxRAMPercentage; dependência yfinance pinada após colunas virarem NULL silenciosamente; diagnóstico de loop de restart silencioso do Watchtower (incompatibilidade de Docker API) que interrompia deploys.</w:t>
+      </w:r>
+    </w:p>
+    <w:p>
+      <w:pPr>
+        <w:spacing w:before="200" w:after="40" w:line="240" w:lineRule="auto"/>
+        <w:jc w:val="left"/>
+      </w:pPr>
+      <w:r>
+        <w:rPr>
+          <w:b/>
+          <w:sz w:val="24"/>
+        </w:rPr>
+        <w:t>Lingua — aprendizado de idiomas com repetição espaçada</w:t>
       </w:r>
     </w:p>
     <w:p>
       <w:pPr>
         <w:pStyle w:val="ListBullet"/>
-        <w:spacing w:after="20"/>
-        <w:ind w:left="283"/>
+        <w:spacing w:line="360" w:lineRule="auto" w:after="40"/>
+        <w:ind w:left="425"/>
+        <w:jc w:val="both"/>
       </w:pPr>
       <w:r>
         <w:rPr>
-          <w:b/>
-          <w:color w:val="1F2A44"/>
+          <w:b w:val="0"/>
+          <w:sz w:val="24"/>
         </w:rPr>
-        <w:t xml:space="preserve">Integrações: </w:t>
-      </w:r>
-      <w:r>
-        <w:rPr>
-          <w:color w:val="444B57"/>
-        </w:rPr>
-        <w:t>Integração com API de mercado financeiro (brapi) para cotações e dados de ativos da bolsa.</w:t>
+        <w:t>Backend Java 21 + Spring Boot + PostgreSQL; clientes desktop (Electron/Wayland) e Android (Capacitor); síntese de voz (edge-tts) e reconhecimento de fala (Whisper) em CPU dentro do container.</w:t>
       </w:r>
     </w:p>
     <w:p>
       <w:pPr>
         <w:pStyle w:val="ListBullet"/>
-        <w:spacing w:after="20"/>
-        <w:ind w:left="283"/>
+        <w:spacing w:line="360" w:lineRule="auto" w:after="40"/>
+        <w:ind w:left="425"/>
+        <w:jc w:val="both"/>
       </w:pPr>
       <w:r>
         <w:rPr>
           <w:b/>
-          <w:color w:val="1F2A44"/>
+          <w:sz w:val="24"/>
         </w:rPr>
-        <w:t xml:space="preserve">CI/CD: </w:t>
+        <w:t xml:space="preserve">Motor de repetição espaçada portado de JavaScript para Java </w:t>
       </w:r>
       <w:r>
         <w:rPr>
-          <w:color w:val="444B57"/>
+          <w:b w:val="0"/>
+          <w:sz w:val="24"/>
         </w:rPr>
-        <w:t>GitHub Actions construindo a imagem Docker e publicando no GitHub Container Registry (GHCR); frontend com deploy automático na Vercel.</w:t>
+        <w:t>com testes diferenciais (200 trajetórias comparadas bit a bit contra o motor original); parâmetros escolhidos por simulação de aluno sintético com ablação — retenção em 7 dias de 81% vs 7% na pior configuração.</w:t>
       </w:r>
     </w:p>
     <w:p>
       <w:pPr>
         <w:pStyle w:val="ListBullet"/>
-        <w:spacing w:after="20"/>
-        <w:ind w:left="283"/>
+        <w:spacing w:line="360" w:lineRule="auto" w:after="40"/>
+        <w:ind w:left="425"/>
+        <w:jc w:val="both"/>
       </w:pPr>
       <w:r>
         <w:rPr>
-          <w:b/>
-          <w:color w:val="1F2A44"/>
+          <w:b w:val="0"/>
+          <w:sz w:val="24"/>
         </w:rPr>
-        <w:t xml:space="preserve">Infra &amp; deploy: </w:t>
-      </w:r>
-      <w:r>
-        <w:rPr>
-          <w:color w:val="444B57"/>
-        </w:rPr>
-        <w:t>Servidor VPS pessoal Debian com Docker. Backend e PostgreSQL em containers numa rede Docker compartilhada, com Watchtower atualizando automaticamente a imagem publicada, healthcheck via Spring Actuator e logs rotacionados. Ambiente de homologação real em hmg.monevas.com / api-hmg.monevas.com antes de promover para produção.</w:t>
+        <w:t>Integração multi-provedor de IA no cliente (Anthropic, OpenAI, Gemini) com saída estruturada; busca de letras e metadados (LRCLIB, Deezer) com candidatas em paralelo usando threads virtuais.</w:t>
       </w:r>
     </w:p>
     <w:p>
       <w:pPr>
         <w:pStyle w:val="ListBullet"/>
-        <w:spacing w:after="20"/>
-        <w:ind w:left="283"/>
+        <w:spacing w:line="360" w:lineRule="auto" w:after="40"/>
+        <w:ind w:left="425"/>
+        <w:jc w:val="both"/>
       </w:pPr>
       <w:r>
         <w:rPr>
           <w:b/>
-          <w:color w:val="1F2A44"/>
+          <w:sz w:val="24"/>
         </w:rPr>
         <w:t xml:space="preserve">Desafios resolvidos: </w:t>
       </w:r>
       <w:r>
         <w:rPr>
-          <w:color w:val="444B57"/>
+          <w:b w:val="0"/>
+          <w:sz w:val="24"/>
         </w:rPr>
-        <w:t>Configurar do zero a infraestrutura (rede Docker, exposição segura de portas só em localhost atrás de proxy, CORS por ambiente, gestão de segredos via .env fora do versionamento), depurar comunicação entre containers (resolução de host pelo nome do serviço, não localhost) e manter a separação dev/hmg/prd para validar cada mudança antes de chegar ao ar.</w:t>
+        <w:t>falha silenciosa de permissão de uid em volume Docker transformada em erro de build com smoke tests na imagem; sincronização de milhares de áudios entre dispositivos via catálogo, manifesto e reconciliação.</w:t>
       </w:r>
     </w:p>
     <w:p>
       <w:pPr>
-        <w:spacing w:before="200" w:after="60"/>
+        <w:spacing w:before="200" w:after="40" w:line="240" w:lineRule="auto"/>
+        <w:jc w:val="left"/>
+      </w:pPr>
+      <w:r>
+        <w:rPr>
+          <w:b/>
+          <w:sz w:val="24"/>
+        </w:rPr>
+        <w:t>Monitorame — logística: frotas, remessas, sensores e rotas</w:t>
+      </w:r>
+    </w:p>
+    <w:p>
+      <w:pPr>
+        <w:pStyle w:val="ListBullet"/>
+        <w:spacing w:line="360" w:lineRule="auto" w:after="40"/>
+        <w:ind w:left="425"/>
+        <w:jc w:val="both"/>
+      </w:pPr>
+      <w:r>
+        <w:rPr>
+          <w:b/>
+          <w:sz w:val="24"/>
+        </w:rPr>
+        <w:t xml:space="preserve">Monólito modular Spring Boot 3.5 com 15 módulos Maven </w:t>
+      </w:r>
+      <w:r>
+        <w:rPr>
+          <w:b w:val="0"/>
+          <w:sz w:val="24"/>
+        </w:rPr>
+        <w:t>e grafo de dependências acíclico; comunicação entre módulos por eventos de domínio Spring; soft delete em todos os recursos.</w:t>
+      </w:r>
+    </w:p>
+    <w:p>
+      <w:pPr>
+        <w:pStyle w:val="ListBullet"/>
+        <w:spacing w:line="360" w:lineRule="auto" w:after="40"/>
+        <w:ind w:left="425"/>
+        <w:jc w:val="both"/>
+      </w:pPr>
+      <w:r>
+        <w:rPr>
+          <w:b w:val="0"/>
+          <w:sz w:val="24"/>
+        </w:rPr>
+        <w:t>Roteirização com OSRM (matriz de distâncias + rotas), fallback determinístico haversine e otimização de paradas por vizinho-mais-próximo + 2-opt; frontend Angular 22 + Leaflet.</w:t>
+      </w:r>
+    </w:p>
+    <w:p>
+      <w:pPr>
+        <w:pStyle w:val="ListBullet"/>
+        <w:spacing w:line="360" w:lineRule="auto" w:after="40"/>
+        <w:ind w:left="425"/>
+        <w:jc w:val="both"/>
+      </w:pPr>
+      <w:r>
+        <w:rPr>
+          <w:b/>
+          <w:sz w:val="24"/>
+        </w:rPr>
+        <w:t xml:space="preserve">Qualidade: </w:t>
+      </w:r>
+      <w:r>
+        <w:rPr>
+          <w:b w:val="0"/>
+          <w:sz w:val="24"/>
+        </w:rPr>
+        <w:t>CI em 3 jobs — backend com Testcontainers (PostgreSQL real), frontend, e2e Playwright; compose em 3 estágios com healthchecks encadeados e Nginx como proxy de /api (elimina CORS e URL de API no bundle).</w:t>
+      </w:r>
+    </w:p>
+    <w:p>
+      <w:pPr>
+        <w:spacing w:before="200" w:after="40" w:line="240" w:lineRule="auto"/>
+        <w:jc w:val="left"/>
+      </w:pPr>
+      <w:r>
+        <w:rPr>
+          <w:b/>
+          <w:sz w:val="24"/>
+        </w:rPr>
+        <w:t>Activity Manager — rastreio de tempo com classificação por IA (Linux)</w:t>
+      </w:r>
+    </w:p>
+    <w:p>
+      <w:pPr>
+        <w:pStyle w:val="ListBullet"/>
+        <w:spacing w:line="360" w:lineRule="auto" w:after="40"/>
+        <w:ind w:left="425"/>
+        <w:jc w:val="both"/>
+      </w:pPr>
+      <w:r>
+        <w:rPr>
+          <w:b w:val="0"/>
+          <w:sz w:val="24"/>
+        </w:rPr>
+        <w:t>Electron integrado ao compositor Hyprland/Wayland (atalhos globais e coleta de janelas/ociosidade via socket de eventos); backend Spring Boot + PostgreSQL.</w:t>
+      </w:r>
+    </w:p>
+    <w:p>
+      <w:pPr>
+        <w:pStyle w:val="ListBullet"/>
+        <w:spacing w:line="360" w:lineRule="auto" w:after="40"/>
+        <w:ind w:left="425"/>
+        <w:jc w:val="both"/>
+      </w:pPr>
+      <w:r>
+        <w:rPr>
+          <w:b/>
+          <w:sz w:val="24"/>
+        </w:rPr>
+        <w:t xml:space="preserve">Classificação em 4 estágios </w:t>
+      </w:r>
+      <w:r>
+        <w:rPr>
+          <w:b w:val="0"/>
+          <w:sz w:val="24"/>
+        </w:rPr>
+        <w:t>(ocioso → regras → cache → fila de IA): o servidor enfileira tarefas e os dispositivos fazem polling de saída (funciona atrás de NAT), executando o modelo localmente (Ollama/Claude); categorias garantidas por enum no schema de saída estruturada; o servidor nunca vê títulos de janela — privacidade por arquitetura.</w:t>
+      </w:r>
+    </w:p>
+    <w:p>
+      <w:pPr>
+        <w:spacing w:before="200" w:after="40" w:line="240" w:lineRule="auto"/>
+        <w:jc w:val="left"/>
+      </w:pPr>
+      <w:r>
+        <w:rPr>
+          <w:b/>
+          <w:sz w:val="24"/>
+        </w:rPr>
+        <w:t>Educa — portal acadêmico multiperfil</w:t>
+      </w:r>
+    </w:p>
+    <w:p>
+      <w:pPr>
+        <w:spacing w:after="80"/>
+      </w:pPr>
+      <w:r>
+        <w:rPr>
+          <w:b w:val="0"/>
+          <w:sz w:val="24"/>
+        </w:rPr>
+        <w:t>Spring Boot 3.5 + PostgreSQL + Flyway; Angular 21 + PrimeNG + Tailwind; dashboards (Chart.js) para aluno, professor e instituição em 23 telas; JWT; 3 ambientes.</w:t>
+      </w:r>
+    </w:p>
+    <w:p>
+      <w:pPr>
+        <w:spacing w:before="200" w:after="40" w:line="240" w:lineRule="auto"/>
+        <w:jc w:val="left"/>
+      </w:pPr>
+      <w:r>
+        <w:rPr>
+          <w:b/>
+          <w:sz w:val="24"/>
+        </w:rPr>
+        <w:t>Outros projetos</w:t>
+      </w:r>
+    </w:p>
+    <w:p>
+      <w:pPr>
+        <w:pStyle w:val="ListBullet"/>
+        <w:spacing w:line="360" w:lineRule="auto" w:after="40"/>
+        <w:ind w:left="425"/>
+        <w:jc w:val="both"/>
+      </w:pPr>
+      <w:r>
+        <w:rPr>
+          <w:b/>
+          <w:sz w:val="24"/>
+        </w:rPr>
+        <w:t xml:space="preserve">mail-reader </w:t>
+      </w:r>
+      <w:r>
+        <w:rPr>
+          <w:b w:val="0"/>
+          <w:sz w:val="24"/>
+        </w:rPr>
+        <w:t>— cliente de e-mail desktop (Electron) com Gmail API e Microsoft Graph via OAuth; tokens cifrados no chaveiro do SO.</w:t>
+      </w:r>
+    </w:p>
+    <w:p>
+      <w:pPr>
+        <w:pStyle w:val="ListBullet"/>
+        <w:spacing w:line="360" w:lineRule="auto" w:after="40"/>
+        <w:ind w:left="425"/>
+        <w:jc w:val="both"/>
+      </w:pPr>
+      <w:r>
+        <w:rPr>
+          <w:b/>
+          <w:sz w:val="24"/>
+        </w:rPr>
+        <w:t xml:space="preserve">Farol </w:t>
+      </w:r>
+      <w:r>
+        <w:rPr>
+          <w:b w:val="0"/>
+          <w:sz w:val="24"/>
+        </w:rPr>
+        <w:t>— localização familiar self-hosted: Node/Express + Socket.IO + PostgreSQL/PostGIS (geofencing com ST_DWithin), PWA Leaflet, integração OwnTracks.</w:t>
+      </w:r>
+    </w:p>
+    <w:p>
+      <w:pPr>
+        <w:pStyle w:val="ListBullet"/>
+        <w:spacing w:line="360" w:lineRule="auto" w:after="40"/>
+        <w:ind w:left="425"/>
+        <w:jc w:val="both"/>
+      </w:pPr>
+      <w:r>
+        <w:rPr>
+          <w:b/>
+          <w:sz w:val="24"/>
+        </w:rPr>
+        <w:t xml:space="preserve">git-manager </w:t>
+      </w:r>
+      <w:r>
+        <w:rPr>
+          <w:b w:val="0"/>
+          <w:sz w:val="24"/>
+        </w:rPr>
+        <w:t>— cliente Git desktop (Electron + simple-git) com grafo de commits e staging visual.</w:t>
+      </w:r>
+    </w:p>
+    <w:p>
+      <w:pPr>
+        <w:pStyle w:val="ListBullet"/>
+        <w:spacing w:line="360" w:lineRule="auto" w:after="40"/>
+        <w:ind w:left="425"/>
+        <w:jc w:val="both"/>
+      </w:pPr>
+      <w:r>
+        <w:rPr>
+          <w:b/>
+          <w:sz w:val="24"/>
+        </w:rPr>
+        <w:t xml:space="preserve">terminal-animado </w:t>
+      </w:r>
+      <w:r>
+        <w:rPr>
+          <w:b w:val="0"/>
+          <w:sz w:val="24"/>
+        </w:rPr>
+        <w:t>— extensão VS Code publicada; animações otimizadas por medição real de CPU (62% → ~1% de núcleo movendo tudo para transform/opacity em GPU).</w:t>
+      </w:r>
+    </w:p>
+    <w:p>
+      <w:pPr>
+        <w:pStyle w:val="ListBullet"/>
+        <w:spacing w:line="360" w:lineRule="auto" w:after="40"/>
+        <w:ind w:left="425"/>
+        <w:jc w:val="both"/>
+      </w:pPr>
+      <w:r>
+        <w:rPr>
+          <w:b/>
+          <w:sz w:val="24"/>
+        </w:rPr>
+        <w:t xml:space="preserve">Observatório de saúde </w:t>
+      </w:r>
+      <w:r>
+        <w:rPr>
+          <w:b w:val="0"/>
+          <w:sz w:val="24"/>
+        </w:rPr>
+        <w:t>— pipeline de dados públicos DATASUS (SIM/SINASC/SIH/CNES): Python + DuckDB/Parquet, decodificação do formato .DBC e análises SQL epidemiológicas.</w:t>
+      </w:r>
+    </w:p>
+    <w:p>
+      <w:pPr>
+        <w:spacing w:before="280" w:after="80" w:line="240" w:lineRule="auto"/>
+        <w:jc w:val="left"/>
         <w:pBdr>
-          <w:bottom w:val="single" w:sz="6" w:space="2" w:color="2E6BE6"/>
+          <w:bottom w:val="single" w:sz="6" w:space="2" w:color="1D4ED8"/>
         </w:pBdr>
       </w:pPr>
       <w:r>
         <w:rPr>
-          <w:rFonts w:ascii="Calibri" w:hAnsi="Calibri"/>
           <w:b/>
-          <w:color w:val="1F2A44"/>
-          <w:sz w:val="23"/>
+          <w:color w:val="1D4ED8"/>
+          <w:sz w:val="24"/>
         </w:rPr>
         <w:t>COMPETÊNCIAS TÉCNICAS</w:t>
       </w:r>
     </w:p>
     <w:p>
       <w:pPr>
-        <w:spacing w:after="40"/>
-        <w:ind w:left="113"/>
+        <w:pStyle w:val="ListBullet"/>
+        <w:spacing w:line="360" w:lineRule="auto" w:after="40"/>
+        <w:ind w:left="425"/>
+        <w:jc w:val="both"/>
       </w:pPr>
       <w:r>
         <w:rPr>
           <w:b/>
-          <w:color w:val="1F2A44"/>
+          <w:sz w:val="24"/>
         </w:rPr>
-        <w:t xml:space="preserve">Linguagens:  </w:t>
+        <w:t xml:space="preserve">Linguagens: </w:t>
       </w:r>
       <w:r>
         <w:rPr>
-          <w:color w:val="444B57"/>
+          <w:b w:val="0"/>
+          <w:sz w:val="24"/>
         </w:rPr>
-        <w:t>Java (avançado), Python (intermediário), TypeScript/JavaScript, Dart, Go, SQL</w:t>
+        <w:t>Java (avançado) · TypeScript/JavaScript · Python · SQL · Go · Dart</w:t>
       </w:r>
     </w:p>
     <w:p>
       <w:pPr>
-        <w:spacing w:after="40"/>
-        <w:ind w:left="113"/>
+        <w:pStyle w:val="ListBullet"/>
+        <w:spacing w:line="360" w:lineRule="auto" w:after="40"/>
+        <w:ind w:left="425"/>
+        <w:jc w:val="both"/>
       </w:pPr>
       <w:r>
         <w:rPr>
           <w:b/>
-          <w:color w:val="1F2A44"/>
+          <w:sz w:val="24"/>
         </w:rPr>
-        <w:t xml:space="preserve">Backend:  </w:t>
+        <w:t xml:space="preserve">Backend: </w:t>
       </w:r>
       <w:r>
         <w:rPr>
-          <w:color w:val="444B57"/>
+          <w:b w:val="0"/>
+          <w:sz w:val="24"/>
         </w:rPr>
-        <w:t>Spring Boot, Spring Cloud (Gateway, Eureka), APIs REST, JWT, microsserviços, Javalin, Django REST Framework, Gin</w:t>
+        <w:t>Spring Boot 2/3 · Spring Cloud (Gateway, Eureka, OpenFeign) · Spring Security (JWT, OAuth2) · APIs REST · JPA/Hibernate · FastAPI · Django REST · Node/Express · Socket.IO/WebSocket</w:t>
       </w:r>
     </w:p>
     <w:p>
       <w:pPr>
-        <w:spacing w:after="40"/>
-        <w:ind w:left="113"/>
+        <w:pStyle w:val="ListBullet"/>
+        <w:spacing w:line="360" w:lineRule="auto" w:after="40"/>
+        <w:ind w:left="425"/>
+        <w:jc w:val="both"/>
       </w:pPr>
       <w:r>
         <w:rPr>
           <w:b/>
-          <w:color w:val="1F2A44"/>
+          <w:sz w:val="24"/>
         </w:rPr>
-        <w:t xml:space="preserve">Frontend:  </w:t>
+        <w:t xml:space="preserve">Mensageria &amp; assíncrono: </w:t>
       </w:r>
       <w:r>
         <w:rPr>
-          <w:color w:val="444B57"/>
+          <w:b w:val="0"/>
+          <w:sz w:val="24"/>
         </w:rPr>
-        <w:t>Angular, PrimeNG, TailwindCSS, RxJS, Flutter (mobile / desktop / web)</w:t>
+        <w:t>RabbitMQ · eventos de domínio Spring · filas de tarefas com polling · @Scheduled/cron · threads virtuais (Java 21)</w:t>
       </w:r>
     </w:p>
     <w:p>
       <w:pPr>
-        <w:spacing w:after="40"/>
-        <w:ind w:left="113"/>
+        <w:pStyle w:val="ListBullet"/>
+        <w:spacing w:line="360" w:lineRule="auto" w:after="40"/>
+        <w:ind w:left="425"/>
+        <w:jc w:val="both"/>
       </w:pPr>
       <w:r>
         <w:rPr>
           <w:b/>
-          <w:color w:val="1F2A44"/>
+          <w:sz w:val="24"/>
         </w:rPr>
-        <w:t xml:space="preserve">Banco de Dados:  </w:t>
+        <w:t xml:space="preserve">Frontend: </w:t>
       </w:r>
       <w:r>
         <w:rPr>
-          <w:color w:val="444B57"/>
+          <w:b w:val="0"/>
+          <w:sz w:val="24"/>
         </w:rPr>
-        <w:t>PostgreSQL — modelagem, criação de tabelas e otimização de queries</w:t>
+        <w:t>Angular 17–22 (PrimeNG, TailwindCSS, RxJS, SSR) · Vue 3 · Electron · Flutter · Capacitor</w:t>
       </w:r>
     </w:p>
     <w:p>
       <w:pPr>
-        <w:spacing w:after="40"/>
-        <w:ind w:left="113"/>
+        <w:pStyle w:val="ListBullet"/>
+        <w:spacing w:line="360" w:lineRule="auto" w:after="40"/>
+        <w:ind w:left="425"/>
+        <w:jc w:val="both"/>
       </w:pPr>
       <w:r>
         <w:rPr>
           <w:b/>
-          <w:color w:val="1F2A44"/>
+          <w:sz w:val="24"/>
         </w:rPr>
-        <w:t xml:space="preserve">DevOps &amp; Infra:  </w:t>
+        <w:t xml:space="preserve">Bancos de dados: </w:t>
       </w:r>
       <w:r>
         <w:rPr>
-          <w:color w:val="444B57"/>
+          <w:b w:val="0"/>
+          <w:sz w:val="24"/>
         </w:rPr>
-        <w:t>Git (DEV/HMG/PRD), Docker e Docker Compose, CI/CD (GitHub Actions, GHCR), Vercel, VPS Debian/Linux, Flyway, Maven</w:t>
+        <w:t>PostgreSQL (+ PostGIS) · Oracle · SQL Server · modelagem e otimização de queries · Flyway · DuckDB/Parquet</w:t>
       </w:r>
     </w:p>
     <w:p>
       <w:pPr>
-        <w:spacing w:after="40"/>
-        <w:ind w:left="113"/>
+        <w:pStyle w:val="ListBullet"/>
+        <w:spacing w:line="360" w:lineRule="auto" w:after="40"/>
+        <w:ind w:left="425"/>
+        <w:jc w:val="both"/>
       </w:pPr>
       <w:r>
         <w:rPr>
           <w:b/>
-          <w:color w:val="1F2A44"/>
+          <w:sz w:val="24"/>
         </w:rPr>
-        <w:t xml:space="preserve">IA no desenvolvimento:  </w:t>
+        <w:t xml:space="preserve">DevOps &amp; Infra: </w:t>
       </w:r>
       <w:r>
         <w:rPr>
-          <w:color w:val="444B57"/>
+          <w:b w:val="0"/>
+          <w:sz w:val="24"/>
         </w:rPr>
-        <w:t>Uso simultâneo de KIMI e Claude para codificação, code review, depuração e arquitetura</w:t>
+        <w:t>Docker/Compose · GitHub Actions · GHCR · Watchtower · Cloudflare Tunnel · Nginx · Linux/VPS · Vercel · Azure Static Web Apps · Prometheus/Actuator</w:t>
       </w:r>
     </w:p>
     <w:p>
       <w:pPr>
-        <w:spacing w:before="200" w:after="60"/>
+        <w:pStyle w:val="ListBullet"/>
+        <w:spacing w:line="360" w:lineRule="auto" w:after="40"/>
+        <w:ind w:left="425"/>
+        <w:jc w:val="both"/>
+      </w:pPr>
+      <w:r>
+        <w:rPr>
+          <w:b/>
+          <w:sz w:val="24"/>
+        </w:rPr>
+        <w:t xml:space="preserve">Testes: </w:t>
+      </w:r>
+      <w:r>
+        <w:rPr>
+          <w:b w:val="0"/>
+          <w:sz w:val="24"/>
+        </w:rPr>
+        <w:t>JUnit · Testcontainers · Playwright (e2e) · Vitest · testes diferenciais e de carga</w:t>
+      </w:r>
+    </w:p>
+    <w:p>
+      <w:pPr>
+        <w:pStyle w:val="ListBullet"/>
+        <w:spacing w:line="360" w:lineRule="auto" w:after="40"/>
+        <w:ind w:left="425"/>
+        <w:jc w:val="both"/>
+      </w:pPr>
+      <w:r>
+        <w:rPr>
+          <w:b/>
+          <w:sz w:val="24"/>
+        </w:rPr>
+        <w:t xml:space="preserve">IA aplicada: </w:t>
+      </w:r>
+      <w:r>
+        <w:rPr>
+          <w:b w:val="0"/>
+          <w:sz w:val="24"/>
+        </w:rPr>
+        <w:t>integração de LLMs (Anthropic, OpenAI, Gemini) com saída estruturada · RPA (Selenium) · IA como par de programação (Claude, KIMI)</w:t>
+      </w:r>
+    </w:p>
+    <w:p>
+      <w:pPr>
+        <w:spacing w:before="280" w:after="80" w:line="240" w:lineRule="auto"/>
+        <w:jc w:val="left"/>
         <w:pBdr>
-          <w:bottom w:val="single" w:sz="6" w:space="2" w:color="2E6BE6"/>
+          <w:bottom w:val="single" w:sz="6" w:space="2" w:color="1D4ED8"/>
         </w:pBdr>
       </w:pPr>
       <w:r>
         <w:rPr>
-          <w:rFonts w:ascii="Calibri" w:hAnsi="Calibri"/>
           <w:b/>
-          <w:color w:val="1F2A44"/>
-          <w:sz w:val="23"/>
+          <w:color w:val="1D4ED8"/>
+          <w:sz w:val="24"/>
         </w:rPr>
         <w:t>FORMAÇÃO ACADÊMICA</w:t>
       </w:r>
     </w:p>
     <w:p>
       <w:pPr>
-        <w:spacing w:before="120" w:after="0"/>
+        <w:spacing w:after="80"/>
       </w:pPr>
       <w:r>
         <w:rPr>
           <w:b/>
-          <w:color w:val="1F2A44"/>
-          <w:sz w:val="21"/>
+          <w:sz w:val="24"/>
         </w:rPr>
-        <w:t>Engenharia da Computação — Escola de Engenharia de Piracicaba (EEP)</w:t>
+        <w:t xml:space="preserve">Engenharia da Computação </w:t>
       </w:r>
       <w:r>
         <w:rPr>
-          <w:i/>
-          <w:color w:val="6B7280"/>
-          <w:sz w:val="19"/>
+          <w:b w:val="0"/>
+          <w:sz w:val="24"/>
         </w:rPr>
-        <w:t xml:space="preserve">   previsão 12/2026</w:t>
+        <w:t>— Escola de Engenharia de Piracicaba (EEP) · previsão de conclusão: 12/2026 (período noturno).</w:t>
       </w:r>
     </w:p>
     <w:p>
       <w:pPr>
-        <w:spacing w:after="40"/>
-      </w:pPr>
-      <w:r>
-        <w:t>Curso no período noturno.</w:t>
-      </w:r>
-    </w:p>
-    <w:p>
-      <w:pPr>
-        <w:spacing w:before="200" w:after="60"/>
+        <w:spacing w:before="280" w:after="80" w:line="240" w:lineRule="auto"/>
+        <w:jc w:val="left"/>
         <w:pBdr>
-          <w:bottom w:val="single" w:sz="6" w:space="2" w:color="2E6BE6"/>
+          <w:bottom w:val="single" w:sz="6" w:space="2" w:color="1D4ED8"/>
         </w:pBdr>
       </w:pPr>
       <w:r>
         <w:rPr>
-          <w:rFonts w:ascii="Calibri" w:hAnsi="Calibri"/>
           <w:b/>
-          <w:color w:val="1F2A44"/>
-          <w:sz w:val="23"/>
+          <w:color w:val="1D4ED8"/>
+          <w:sz w:val="24"/>
         </w:rPr>
         <w:t>IDIOMAS</w:t>
       </w:r>
     </w:p>
     <w:p>
       <w:pPr>
-        <w:pStyle w:val="ListBullet"/>
-        <w:spacing w:after="20"/>
-        <w:ind w:left="283"/>
+        <w:spacing w:after="80"/>
       </w:pPr>
       <w:r>
         <w:rPr>
           <w:b/>
-          <w:color w:val="1F2A44"/>
+          <w:sz w:val="24"/>
         </w:rPr>
-        <w:t xml:space="preserve">Inglês Avançado — </w:t>
+        <w:t xml:space="preserve">Português </w:t>
       </w:r>
       <w:r>
         <w:rPr>
-          <w:color w:val="444B57"/>
+          <w:b w:val="0"/>
+          <w:sz w:val="24"/>
         </w:rPr>
-        <w:t>cursos Red Balloon, Cultura Inglesa e Wise Up; experiência prática em viagens aos EUA.</w:t>
+        <w:t xml:space="preserve">— nativo.   </w:t>
       </w:r>
-    </w:p>
-    <w:p>
-      <w:pPr>
-        <w:pStyle w:val="ListBullet"/>
-        <w:spacing w:after="20"/>
-        <w:ind w:left="283"/>
-      </w:pPr>
       <w:r>
         <w:rPr>
           <w:b/>
-          <w:color w:val="1F2A44"/>
+          <w:sz w:val="24"/>
         </w:rPr>
-        <w:t xml:space="preserve">Português — </w:t>
+        <w:t xml:space="preserve">Inglês </w:t>
       </w:r>
       <w:r>
         <w:rPr>
-          <w:color w:val="444B57"/>
+          <w:b w:val="0"/>
+          <w:sz w:val="24"/>
         </w:rPr>
-        <w:t>nativo.</w:t>
+        <w:t>— avançado (Red Balloon, Cultura Inglesa e Wise Up; vivência em viagens aos EUA).</w:t>
       </w:r>
     </w:p>
     <w:sectPr>
-      <w:pgSz w:w="12240" w:h="15840"/>
-      <w:pgMar w:top="794" w:right="1020" w:bottom="794" w:left="1020" w:header="720" w:footer="720" w:gutter="0"/>
+      <w:pgSz w:w="11906" w:h="16838"/>
+      <w:pgMar w:top="1701" w:right="1134" w:bottom="1134" w:left="1701" w:header="720" w:footer="720" w:gutter="0"/>
       <w:cols w:space="720"/>
       <w:docGrid w:linePitch="360"/>
     </w:sectPr>
@@ -1364,12 +1565,12 @@
     <w:qFormat/>
     <w:rsid w:val="00FC693F"/>
     <w:pPr>
-      <w:spacing w:after="40" w:line="259" w:lineRule="auto"/>
+      <w:spacing w:line="360" w:lineRule="auto" w:after="0"/>
+      <w:jc w:val="both"/>
     </w:pPr>
     <w:rPr>
-      <w:rFonts w:ascii="Calibri" w:hAnsi="Calibri"/>
-      <w:color w:val="444B57"/>
-      <w:sz w:val="21"/>
+      <w:rFonts w:ascii="Times New Roman" w:hAnsi="Times New Roman"/>
+      <w:sz w:val="24"/>
     </w:rPr>
   </w:style>
   <w:style w:type="paragraph" w:styleId="Header">

</xml_diff>

<commit_message>
fix: atualiza arquivos do currículo em formato DOCX e PDF para versões mais recentes
</commit_message>
<xml_diff>
--- a/CurricullumZem.docx
+++ b/CurricullumZem.docx
@@ -4,13 +4,15 @@
   <w:body>
     <w:p>
       <w:pPr>
-        <w:spacing w:before="0" w:after="40" w:line="240" w:lineRule="auto"/>
+        <w:keepNext w:val="0"/>
+        <w:widowControl/>
+        <w:spacing w:line="240" w:lineRule="auto" w:before="0" w:after="40"/>
         <w:jc w:val="center"/>
       </w:pPr>
       <w:r>
         <w:rPr>
+          <w:rFonts w:ascii="Times New Roman" w:hAnsi="Times New Roman"/>
           <w:b/>
-          <w:color w:val="000000"/>
           <w:sz w:val="32"/>
         </w:rPr>
         <w:t>MATHEUS LAJARIN ZEM</w:t>
@@ -18,11 +20,14 @@
     </w:p>
     <w:p>
       <w:pPr>
-        <w:spacing w:before="0" w:after="40" w:line="240" w:lineRule="auto"/>
+        <w:keepNext w:val="0"/>
+        <w:widowControl/>
+        <w:spacing w:line="240" w:lineRule="auto" w:before="0" w:after="40"/>
         <w:jc w:val="center"/>
       </w:pPr>
       <w:r>
         <w:rPr>
+          <w:rFonts w:ascii="Times New Roman" w:hAnsi="Times New Roman"/>
           <w:b/>
           <w:color w:val="1D4ED8"/>
           <w:sz w:val="24"/>
@@ -32,42 +37,158 @@
     </w:p>
     <w:p>
       <w:pPr>
-        <w:spacing w:before="0" w:after="0" w:line="240" w:lineRule="auto"/>
+        <w:keepNext w:val="0"/>
+        <w:widowControl/>
+        <w:spacing w:line="240" w:lineRule="auto" w:before="0" w:after="40"/>
         <w:jc w:val="center"/>
       </w:pPr>
       <w:r>
         <w:rPr>
+          <w:rFonts w:ascii="Times New Roman" w:hAnsi="Times New Roman"/>
           <w:b w:val="0"/>
           <w:color w:val="444444"/>
           <w:sz w:val="22"/>
         </w:rPr>
-        <w:t>Piracicaba/SP · +55 (19) 99985-1929 (WhatsApp) · matheuslajazem@gmail.com</w:t>
+        <w:t xml:space="preserve">Piracicaba/SP · +55 (19) 99985-1929 (WhatsApp) · </w:t>
+      </w:r>
+      <w:hyperlink r:id="rId9">
+        <w:r>
+          <w:rPr>
+            <w:rFonts w:ascii="Times New Roman" w:hAnsi="Times New Roman"/>
+            <w:sz w:val="22"/>
+            <w:szCs w:val="22"/>
+            <w:color w:val="1D4ED8"/>
+            <w:u w:val="single"/>
+          </w:rPr>
+          <w:t>matheuslajazem@gmail.com</w:t>
+        </w:r>
+      </w:hyperlink>
+    </w:p>
+    <w:p>
+      <w:pPr>
+        <w:keepNext w:val="0"/>
+        <w:widowControl/>
+        <w:spacing w:line="240" w:lineRule="auto" w:before="0" w:after="120"/>
+        <w:jc w:val="center"/>
+      </w:pPr>
+      <w:r>
+        <w:rPr>
+          <w:rFonts w:ascii="Times New Roman" w:hAnsi="Times New Roman"/>
+          <w:b w:val="0"/>
+          <w:color w:val="444444"/>
+          <w:sz w:val="22"/>
+        </w:rPr>
+      </w:r>
+      <w:hyperlink r:id="rId10">
+        <w:r>
+          <w:rPr>
+            <w:rFonts w:ascii="Times New Roman" w:hAnsi="Times New Roman"/>
+            <w:sz w:val="22"/>
+            <w:szCs w:val="22"/>
+            <w:color w:val="1D4ED8"/>
+            <w:u w:val="single"/>
+          </w:rPr>
+          <w:t>linkedin.com/in/matheus-lajarin-zem-17b39b289</w:t>
+        </w:r>
+      </w:hyperlink>
+      <w:r>
+        <w:rPr>
+          <w:rFonts w:ascii="Times New Roman" w:hAnsi="Times New Roman"/>
+          <w:b w:val="0"/>
+          <w:color w:val="444444"/>
+          <w:sz w:val="22"/>
+        </w:rPr>
+        <w:t xml:space="preserve"> · </w:t>
+      </w:r>
+      <w:hyperlink r:id="rId11">
+        <w:r>
+          <w:rPr>
+            <w:rFonts w:ascii="Times New Roman" w:hAnsi="Times New Roman"/>
+            <w:sz w:val="22"/>
+            <w:szCs w:val="22"/>
+            <w:color w:val="1D4ED8"/>
+            <w:u w:val="single"/>
+          </w:rPr>
+          <w:t>github.com/MatheusZem12</w:t>
+        </w:r>
+      </w:hyperlink>
+    </w:p>
+    <w:p>
+      <w:pPr>
+        <w:keepNext/>
+        <w:widowControl/>
+        <w:spacing w:line="240" w:lineRule="auto" w:before="100" w:after="40"/>
+        <w:jc w:val="left"/>
+      </w:pPr>
+      <w:r>
+        <w:rPr>
+          <w:rFonts w:ascii="Times New Roman" w:hAnsi="Times New Roman"/>
+          <w:b/>
+          <w:color w:val="1D4ED8"/>
+          <w:sz w:val="24"/>
+        </w:rPr>
+        <w:t>OBJETIVO</w:t>
       </w:r>
     </w:p>
     <w:p>
       <w:pPr>
-        <w:spacing w:before="0" w:after="0" w:line="240" w:lineRule="auto"/>
-        <w:jc w:val="center"/>
+        <w:keepNext w:val="0"/>
+        <w:widowControl/>
+        <w:spacing w:line="360" w:lineRule="auto" w:before="0" w:after="40"/>
+        <w:jc w:val="both"/>
       </w:pPr>
       <w:r>
         <w:rPr>
+          <w:rFonts w:ascii="Times New Roman" w:hAnsi="Times New Roman"/>
           <w:b w:val="0"/>
-          <w:color w:val="444444"/>
-          <w:sz w:val="22"/>
+          <w:sz w:val="24"/>
         </w:rPr>
-        <w:t>linkedin.com/in/matheus-lajarin-zem-17b39b289 · github.com/MatheusZem12</w:t>
+        <w:t>Atuar como desenvolvedor backend, a parte do sistema que processa os dados e as regras do negócio, com ênfase em bancos de dados e no desenho de soluções: entender o problema, projetar o sistema e acompanhá-lo até funcionar bem no dia a dia.</w:t>
       </w:r>
     </w:p>
     <w:p>
       <w:pPr>
-        <w:spacing w:before="280" w:after="80" w:line="240" w:lineRule="auto"/>
+        <w:keepNext/>
+        <w:widowControl/>
+        <w:spacing w:line="240" w:lineRule="auto" w:before="100" w:after="40"/>
         <w:jc w:val="left"/>
-        <w:pBdr>
-          <w:bottom w:val="single" w:sz="6" w:space="2" w:color="1D4ED8"/>
-        </w:pBdr>
       </w:pPr>
       <w:r>
         <w:rPr>
+          <w:rFonts w:ascii="Times New Roman" w:hAnsi="Times New Roman"/>
+          <w:b/>
+          <w:color w:val="1D4ED8"/>
+          <w:sz w:val="24"/>
+        </w:rPr>
+        <w:t>PERFIL</w:t>
+      </w:r>
+    </w:p>
+    <w:p>
+      <w:pPr>
+        <w:keepNext w:val="0"/>
+        <w:widowControl/>
+        <w:spacing w:line="360" w:lineRule="auto" w:before="0" w:after="40"/>
+        <w:jc w:val="both"/>
+      </w:pPr>
+      <w:r>
+        <w:rPr>
+          <w:rFonts w:ascii="Times New Roman" w:hAnsi="Times New Roman"/>
+          <w:b w:val="0"/>
+          <w:sz w:val="24"/>
+        </w:rPr>
+        <w:t>Sou comunicativo e colaborativo. Gosto de trazer minha visão ao problema, contribuir em conversas de brainstorming e discordar com respeito e bons argumentos quando vejo um caminho melhor. Penso fora da caixa e trato problemas como quebra-cabeças: prefiro verificar a supor, meço antes de mudar e investigo cada falha até encontrar a causa verdadeira, assumindo responsabilidade do início ao fim pelo que entrego.</w:t>
+      </w:r>
+    </w:p>
+    <w:p>
+      <w:pPr>
+        <w:keepNext/>
+        <w:widowControl/>
+        <w:spacing w:line="240" w:lineRule="auto" w:before="100" w:after="40"/>
+        <w:jc w:val="left"/>
+      </w:pPr>
+      <w:r>
+        <w:rPr>
+          <w:rFonts w:ascii="Times New Roman" w:hAnsi="Times New Roman"/>
           <w:b/>
           <w:color w:val="1D4ED8"/>
           <w:sz w:val="24"/>
@@ -77,64 +198,46 @@
     </w:p>
     <w:p>
       <w:pPr>
-        <w:spacing w:after="80"/>
+        <w:keepNext w:val="0"/>
+        <w:widowControl/>
+        <w:spacing w:line="360" w:lineRule="auto" w:before="0" w:after="40"/>
+        <w:jc w:val="both"/>
       </w:pPr>
       <w:r>
         <w:rPr>
+          <w:rFonts w:ascii="Times New Roman" w:hAnsi="Times New Roman"/>
           <w:b w:val="0"/>
           <w:sz w:val="24"/>
         </w:rPr>
-        <w:t>Desenvolvedor Full Stack com atuação de ponta a ponta: modelagem de dados, APIs, microsserviços, frontend, CI/CD e operação em produção. Experiência corporativa no ecossistema agroindustrial (ERP TOTVS PIMS), em duas linhas de produto em microsserviços (Spring Boot 3, Spring Cloud Gateway, Eureka, OpenFeign) com integrações críticas — SAP, TOTVS Protheus, plataformas B2B e hardware industrial — sobre bancos Oracle, SQL Server e PostgreSQL.</w:t>
+        <w:t>Desenvolvedor que atua em todas as etapas de um sistema: entender a necessidade, organizar os dados, construir a lógica, criar as telas e manter tudo funcionando depois de entregue. Minha principal característica é a flexibilidade tecnológica. Já entreguei sistemas em produção nas principais tecnologias do mercado, como Java, Angular e Python, e me adapto com rapidez a ferramentas novas, porque domino os fundamentos que todas elas têm em comum.</w:t>
       </w:r>
     </w:p>
     <w:p>
       <w:pPr>
-        <w:spacing w:after="80"/>
+        <w:keepNext w:val="0"/>
+        <w:widowControl/>
+        <w:spacing w:line="360" w:lineRule="auto" w:before="0" w:after="40"/>
+        <w:jc w:val="both"/>
       </w:pPr>
       <w:r>
         <w:rPr>
+          <w:rFonts w:ascii="Times New Roman" w:hAnsi="Times New Roman"/>
           <w:b w:val="0"/>
           <w:sz w:val="24"/>
         </w:rPr>
-        <w:t xml:space="preserve">Em paralelo, projeto, construo e </w:t>
-      </w:r>
-      <w:r>
-        <w:rPr>
-          <w:b/>
-          <w:sz w:val="24"/>
-        </w:rPr>
-        <w:t>opero produtos próprios em produção</w:t>
-      </w:r>
-      <w:r>
-        <w:rPr>
-          <w:b w:val="0"/>
-          <w:sz w:val="24"/>
-        </w:rPr>
-        <w:t>: uma VPS Linux hospeda três backends Spring Boot em Docker, com pipeline GitHub Actions → GHCR → Watchtower (deploy pull-based), borda via Cloudflare Tunnel e ambientes DEV/HMG/PRD reais. Foco em engenharia verificável: migrações Flyway versionadas, testes com JUnit, Testcontainers, Playwright e Vitest, e segurança com JWT, OAuth2, 2FA, criptografia AES-GCM e rate limiting.</w:t>
+        <w:t>Na prática, sei estruturar sistemas grandes de forma organizada, fazer sistemas diferentes conversarem entre si (como integrar um produto novo a um ERP que a empresa já usa), proteger dados sensíveis e garantir qualidade com testes automatizados. Também crio e mantenho produtos próprios que estão no ar hoje, cuidando de todas as partes: servidor, publicação de novas versões e monitoramento.</w:t>
       </w:r>
     </w:p>
     <w:p>
       <w:pPr>
-        <w:spacing w:after="80"/>
+        <w:keepNext/>
+        <w:widowControl/>
+        <w:spacing w:line="240" w:lineRule="auto" w:before="100" w:after="40"/>
+        <w:jc w:val="left"/>
       </w:pPr>
       <w:r>
         <w:rPr>
-          <w:b w:val="0"/>
-          <w:sz w:val="24"/>
-        </w:rPr>
-        <w:t>Conhecimento de mensageria (RabbitMQ) e uso prático de padrões assíncronos: eventos de domínio, filas de tarefas com polling, jobs agendados e threads virtuais. Uso assistentes de IA (Claude e KIMI) como par de programação — codificação, revisão, depuração e arquitetura — sempre validando os resultados.</w:t>
-      </w:r>
-    </w:p>
-    <w:p>
-      <w:pPr>
-        <w:spacing w:before="280" w:after="80" w:line="240" w:lineRule="auto"/>
-        <w:jc w:val="left"/>
-        <w:pBdr>
-          <w:bottom w:val="single" w:sz="6" w:space="2" w:color="1D4ED8"/>
-        </w:pBdr>
-      </w:pPr>
-      <w:r>
-        <w:rPr>
+          <w:rFonts w:ascii="Times New Roman" w:hAnsi="Times New Roman"/>
           <w:b/>
           <w:color w:val="1D4ED8"/>
           <w:sz w:val="24"/>
@@ -144,229 +247,126 @@
     </w:p>
     <w:p>
       <w:pPr>
-        <w:spacing w:before="200" w:after="40" w:line="240" w:lineRule="auto"/>
+        <w:keepNext/>
+        <w:widowControl/>
+        <w:spacing w:line="240" w:lineRule="auto" w:before="100" w:after="40"/>
         <w:jc w:val="left"/>
       </w:pPr>
       <w:r>
         <w:rPr>
+          <w:rFonts w:ascii="Times New Roman" w:hAnsi="Times New Roman"/>
           <w:b/>
           <w:sz w:val="24"/>
         </w:rPr>
-        <w:t>TOTVS (setor agroindustrial) — Desenvolvedor Full Stack Pleno (PJ)</w:t>
-      </w:r>
-      <w:r>
-        <w:rPr>
-          <w:i/>
-          <w:color w:val="444444"/>
-          <w:sz w:val="22"/>
-        </w:rPr>
-        <w:t xml:space="preserve">   nov/2024 – atual</w:t>
+        <w:t>TOTVS (setor agroindustrial) · Desenvolvedor Full Stack Pleno (PJ) · nov/2024 – atual</w:t>
       </w:r>
     </w:p>
     <w:p>
       <w:pPr>
-        <w:spacing w:after="80"/>
+        <w:keepNext w:val="0"/>
+        <w:widowControl/>
+        <w:spacing w:line="360" w:lineRule="auto" w:before="0" w:after="40"/>
+        <w:jc w:val="both"/>
       </w:pPr>
       <w:r>
         <w:rPr>
+          <w:rFonts w:ascii="Times New Roman" w:hAnsi="Times New Roman"/>
           <w:b w:val="0"/>
           <w:sz w:val="24"/>
         </w:rPr>
-        <w:t>Desenvolvimento e manutenção de plataformas de gestão agroindustrial — custos, fluxo de caixa, materiais, fornecedores, pesagem/balança, produção industrial e otimização de colheita — em arquitetura de microsserviços, integradas ao ERP PIMS.</w:t>
+        <w:t>Desenvolvo e mantenho sistemas de gestão para empresas do agronegócio, integrados ao ERP TOTVS PIMS, cobrindo áreas como custos, fluxo de caixa, compras, fornecedores, pesagem de caminhões e produção industrial. São duas linhas de produto que somam cerca de trinta serviços funcionando em conjunto, construídos em Java (Spring Boot).</w:t>
       </w:r>
     </w:p>
     <w:p>
       <w:pPr>
-        <w:pStyle w:val="ListBullet"/>
-        <w:spacing w:line="360" w:lineRule="auto" w:after="40"/>
-        <w:ind w:left="425"/>
+        <w:keepNext w:val="0"/>
+        <w:widowControl/>
+        <w:spacing w:line="360" w:lineRule="auto" w:before="0" w:after="40"/>
         <w:jc w:val="both"/>
       </w:pPr>
       <w:r>
         <w:rPr>
-          <w:b/>
-          <w:sz w:val="24"/>
-        </w:rPr>
-        <w:t xml:space="preserve">Microsserviços: </w:t>
-      </w:r>
-      <w:r>
-        <w:rPr>
+          <w:rFonts w:ascii="Times New Roman" w:hAnsi="Times New Roman"/>
           <w:b w:val="0"/>
           <w:sz w:val="24"/>
         </w:rPr>
-        <w:t>atuação em duas linhas de produto que somam ~30 serviços Spring Boot 3 (Java 17/21), com dois padrões de gateway — Spring Cloud Gateway com rotas estáticas + OpenFeign numa linha, e Gateway + Netflix Eureka (service discovery, 13 rotas) na outra; observabilidade com Actuator e Prometheus.</w:t>
+        <w:t>Grande parte do meu trabalho é fazer sistemas diferentes conversarem. Conecto os produtos ao SAP (contratos, notas fiscais, pesagens e custos), a outros sistemas da TOTVS, a uma plataforma de compras e até a uma balança industrial que envia o peso dos caminhões direto para o sistema. Para isso trabalho com três bancos de dados ao mesmo tempo (PostgreSQL, Oracle e SQL Server), cuidando da organização e do desempenho das consultas.</w:t>
       </w:r>
     </w:p>
     <w:p>
       <w:pPr>
-        <w:pStyle w:val="ListBullet"/>
-        <w:spacing w:line="360" w:lineRule="auto" w:after="40"/>
-        <w:ind w:left="425"/>
+        <w:keepNext w:val="0"/>
+        <w:widowControl/>
+        <w:spacing w:line="360" w:lineRule="auto" w:before="0" w:after="40"/>
         <w:jc w:val="both"/>
       </w:pPr>
       <w:r>
         <w:rPr>
-          <w:b/>
-          <w:sz w:val="24"/>
-        </w:rPr>
-        <w:t xml:space="preserve">Integrações críticas: </w:t>
-      </w:r>
-      <w:r>
-        <w:rPr>
+          <w:rFonts w:ascii="Times New Roman" w:hAnsi="Times New Roman"/>
           <w:b w:val="0"/>
           <w:sz w:val="24"/>
         </w:rPr>
-        <w:t>conector SAP (contratos, notas fiscais, pesagens, provisões e custos), interfaces PIMS ↔ TOTVS Protheus, plataforma de compras CIB2B, helpdesk Milvus (API REST + RPA com Selenium) e leitura de balança industrial Toledo via socket TCP.</w:t>
+        <w:t>Também modernizo sistemas antigos, reescrevendo-os em versões atuais das tecnologias sem parar a operação, e desenvolvo as telas que os usuários utilizam (Angular). Toda entrega passa por três ambientes (desenvolvimento, testes e produção) com publicação automatizada.</w:t>
       </w:r>
     </w:p>
     <w:p>
       <w:pPr>
-        <w:pStyle w:val="ListBullet"/>
-        <w:spacing w:line="360" w:lineRule="auto" w:after="40"/>
-        <w:ind w:left="425"/>
+        <w:keepNext/>
+        <w:widowControl/>
+        <w:spacing w:line="240" w:lineRule="auto" w:before="100" w:after="40"/>
+        <w:jc w:val="left"/>
+      </w:pPr>
+      <w:r>
+        <w:rPr>
+          <w:rFonts w:ascii="Times New Roman" w:hAnsi="Times New Roman"/>
+          <w:b/>
+          <w:sz w:val="24"/>
+        </w:rPr>
+        <w:t>CNH Industrial · Estágio em Gestão de Projetos · jun/2022 – jun/2024</w:t>
+      </w:r>
+    </w:p>
+    <w:p>
+      <w:pPr>
+        <w:keepNext w:val="0"/>
+        <w:widowControl/>
+        <w:spacing w:line="360" w:lineRule="auto" w:before="0" w:after="40"/>
         <w:jc w:val="both"/>
       </w:pPr>
       <w:r>
         <w:rPr>
-          <w:b/>
-          <w:sz w:val="24"/>
-        </w:rPr>
-        <w:t xml:space="preserve">Multi-banco: </w:t>
-      </w:r>
-      <w:r>
-        <w:rPr>
+          <w:rFonts w:ascii="Times New Roman" w:hAnsi="Times New Roman"/>
           <w:b w:val="0"/>
           <w:sz w:val="24"/>
         </w:rPr>
-        <w:t>PostgreSQL nos produtos, Oracle no ERP PIMS e SQL Server no PIMS Multicultivo — modelagem, otimização de queries e jobs de sincronização (@Scheduled) entre ERP e produtos.</w:t>
+        <w:t>Gestão de peças em projetos, do cadastro à relação com fornecedores, com automação de controles e análise de dados via macros e tabelas dinâmicas.</w:t>
       </w:r>
     </w:p>
     <w:p>
       <w:pPr>
-        <w:pStyle w:val="ListBullet"/>
-        <w:spacing w:line="360" w:lineRule="auto" w:after="40"/>
-        <w:ind w:left="425"/>
+        <w:keepNext/>
+        <w:widowControl/>
+        <w:spacing w:line="240" w:lineRule="auto" w:before="100" w:after="40"/>
+        <w:jc w:val="left"/>
+      </w:pPr>
+      <w:r>
+        <w:rPr>
+          <w:rFonts w:ascii="Times New Roman" w:hAnsi="Times New Roman"/>
+          <w:b/>
+          <w:sz w:val="24"/>
+        </w:rPr>
+        <w:t>Elring Klinger · Estágio em Kaizen · mar/2022 – mai/2022</w:t>
+      </w:r>
+    </w:p>
+    <w:p>
+      <w:pPr>
+        <w:keepNext w:val="0"/>
+        <w:widowControl/>
+        <w:spacing w:line="360" w:lineRule="auto" w:before="0" w:after="40"/>
         <w:jc w:val="both"/>
       </w:pPr>
       <w:r>
         <w:rPr>
-          <w:b/>
-          <w:sz w:val="24"/>
-        </w:rPr>
-        <w:t xml:space="preserve">Modernização de legado: </w:t>
-      </w:r>
-      <w:r>
-        <w:rPr>
-          <w:b w:val="0"/>
-          <w:sz w:val="24"/>
-        </w:rPr>
-        <w:t>reescrita de integrações Java 8 / Spring Boot 2 (WAR em Tomcat) para Java 17/21 / Spring Boot 3, e participação na evolução de produto legado (Angular 8 → Angular 19).</w:t>
-      </w:r>
-    </w:p>
-    <w:p>
-      <w:pPr>
-        <w:pStyle w:val="ListBullet"/>
-        <w:spacing w:line="360" w:lineRule="auto" w:after="40"/>
-        <w:ind w:left="425"/>
-        <w:jc w:val="both"/>
-      </w:pPr>
-      <w:r>
-        <w:rPr>
-          <w:b/>
-          <w:sz w:val="24"/>
-        </w:rPr>
-        <w:t xml:space="preserve">Frontend: </w:t>
-      </w:r>
-      <w:r>
-        <w:rPr>
-          <w:b w:val="0"/>
-          <w:sz w:val="24"/>
-        </w:rPr>
-        <w:t>portais Angular 17–20 (PrimeNG, TailwindCSS, ECharts/Chart.js, i18n), incluindo Angular 20 com SSR; manutenção de produto de gestão pecuária em Python/Django REST + Vue 3 com suporte simultâneo a Oracle, SQL Server e PostgreSQL.</w:t>
-      </w:r>
-    </w:p>
-    <w:p>
-      <w:pPr>
-        <w:pStyle w:val="ListBullet"/>
-        <w:spacing w:line="360" w:lineRule="auto" w:after="40"/>
-        <w:ind w:left="425"/>
-        <w:jc w:val="both"/>
-      </w:pPr>
-      <w:r>
-        <w:rPr>
-          <w:b/>
-          <w:sz w:val="24"/>
-        </w:rPr>
-        <w:t xml:space="preserve">CI/CD: </w:t>
-      </w:r>
-      <w:r>
-        <w:rPr>
-          <w:b w:val="0"/>
-          <w:sz w:val="24"/>
-        </w:rPr>
-        <w:t>pipelines GitHub Actions com deploy de portal em Azure Static Web Apps em 3 ambientes; fluxo Git DEV/HMG/PRD.</w:t>
-      </w:r>
-    </w:p>
-    <w:p>
-      <w:pPr>
-        <w:spacing w:before="200" w:after="40" w:line="240" w:lineRule="auto"/>
-        <w:jc w:val="left"/>
-      </w:pPr>
-      <w:r>
-        <w:rPr>
-          <w:b/>
-          <w:sz w:val="24"/>
-        </w:rPr>
-        <w:t>CNH Industrial — Estágio em Gestão de Projetos</w:t>
-      </w:r>
-      <w:r>
-        <w:rPr>
-          <w:i/>
-          <w:color w:val="444444"/>
-          <w:sz w:val="22"/>
-        </w:rPr>
-        <w:t xml:space="preserve">   jun/2022 – jun/2024</w:t>
-      </w:r>
-    </w:p>
-    <w:p>
-      <w:pPr>
-        <w:spacing w:after="80"/>
-      </w:pPr>
-      <w:r>
-        <w:rPr>
-          <w:b w:val="0"/>
-          <w:sz w:val="24"/>
-        </w:rPr>
-        <w:t>Gestão de peças em projetos, do cadastro à relação com fornecedores; automação de controle e análise de dados com macros e tabelas dinâmicas.</w:t>
-      </w:r>
-    </w:p>
-    <w:p>
-      <w:pPr>
-        <w:spacing w:before="200" w:after="40" w:line="240" w:lineRule="auto"/>
-        <w:jc w:val="left"/>
-      </w:pPr>
-      <w:r>
-        <w:rPr>
-          <w:b/>
-          <w:sz w:val="24"/>
-        </w:rPr>
-        <w:t>Elring Klinger — Estágio em Kaizen</w:t>
-      </w:r>
-      <w:r>
-        <w:rPr>
-          <w:i/>
-          <w:color w:val="444444"/>
-          <w:sz w:val="22"/>
-        </w:rPr>
-        <w:t xml:space="preserve">   mar/2022 – mai/2022</w:t>
-      </w:r>
-    </w:p>
-    <w:p>
-      <w:pPr>
-        <w:spacing w:after="80"/>
-      </w:pPr>
-      <w:r>
-        <w:rPr>
+          <w:rFonts w:ascii="Times New Roman" w:hAnsi="Times New Roman"/>
           <w:b w:val="0"/>
           <w:sz w:val="24"/>
         </w:rPr>
@@ -375,14 +375,14 @@
     </w:p>
     <w:p>
       <w:pPr>
-        <w:spacing w:before="280" w:after="80" w:line="240" w:lineRule="auto"/>
+        <w:keepNext/>
+        <w:widowControl/>
+        <w:spacing w:line="240" w:lineRule="auto" w:before="100" w:after="40"/>
         <w:jc w:val="left"/>
-        <w:pBdr>
-          <w:bottom w:val="single" w:sz="6" w:space="2" w:color="1D4ED8"/>
-        </w:pBdr>
       </w:pPr>
       <w:r>
         <w:rPr>
+          <w:rFonts w:ascii="Times New Roman" w:hAnsi="Times New Roman"/>
           <w:b/>
           <w:color w:val="1D4ED8"/>
           <w:sz w:val="24"/>
@@ -392,410 +392,186 @@
     </w:p>
     <w:p>
       <w:pPr>
-        <w:spacing w:after="80"/>
+        <w:keepNext w:val="0"/>
+        <w:widowControl/>
+        <w:spacing w:line="360" w:lineRule="auto" w:before="0" w:after="40"/>
+        <w:jc w:val="both"/>
       </w:pPr>
       <w:r>
         <w:rPr>
-          <w:i/>
+          <w:rFonts w:ascii="Times New Roman" w:hAnsi="Times New Roman"/>
+          <w:b w:val="0"/>
           <w:sz w:val="24"/>
         </w:rPr>
-        <w:t>Produtos completos que concebi, desenvolvi e opero sozinho em produção — backend, frontend, banco, CI/CD e infraestrutura — usando IA (Claude e KIMI) como par de programação.</w:t>
+        <w:t>Produtos que criei do zero e mantenho funcionando no ar, cuidando de todas as partes: sistema, banco de dados, servidor e publicação. Uso assistentes de IA como apoio, sempre revisando criticamente o resultado.</w:t>
       </w:r>
     </w:p>
     <w:p>
       <w:pPr>
-        <w:spacing w:before="200" w:after="40" w:line="240" w:lineRule="auto"/>
+        <w:keepNext/>
+        <w:widowControl/>
+        <w:spacing w:line="240" w:lineRule="auto" w:before="100" w:after="40"/>
         <w:jc w:val="left"/>
       </w:pPr>
       <w:r>
         <w:rPr>
+          <w:rFonts w:ascii="Times New Roman" w:hAnsi="Times New Roman"/>
           <w:b/>
           <w:sz w:val="24"/>
         </w:rPr>
-        <w:t>Monevas — finanças pessoais e análise de investimentos</w:t>
       </w:r>
       <w:r>
         <w:rPr>
-          <w:i/>
-          <w:color w:val="444444"/>
-          <w:sz w:val="22"/>
+          <w:rFonts w:ascii="Times New Roman" w:hAnsi="Times New Roman"/>
+          <w:b/>
+          <w:sz w:val="24"/>
         </w:rPr>
-        <w:t xml:space="preserve">   hmg.monevas.com</w:t>
+        <w:t>Monevas: finanças pessoais e análise de investimentos (</w:t>
+      </w:r>
+      <w:hyperlink r:id="rId12">
+        <w:r>
+          <w:rPr>
+            <w:rFonts w:ascii="Times New Roman" w:hAnsi="Times New Roman"/>
+            <w:sz w:val="24"/>
+            <w:szCs w:val="24"/>
+            <w:color w:val="1D4ED8"/>
+            <w:u w:val="single"/>
+            <w:b/>
+          </w:rPr>
+          <w:t>hmg.monevas.com</w:t>
+        </w:r>
+      </w:hyperlink>
+      <w:r>
+        <w:rPr>
+          <w:rFonts w:ascii="Times New Roman" w:hAnsi="Times New Roman"/>
+          <w:b/>
+          <w:sz w:val="24"/>
+        </w:rPr>
+        <w:t>)</w:t>
       </w:r>
     </w:p>
     <w:p>
       <w:pPr>
-        <w:pStyle w:val="ListBullet"/>
-        <w:spacing w:line="360" w:lineRule="auto" w:after="40"/>
-        <w:ind w:left="425"/>
+        <w:keepNext w:val="0"/>
+        <w:widowControl/>
+        <w:spacing w:line="360" w:lineRule="auto" w:before="0" w:after="40"/>
         <w:jc w:val="both"/>
       </w:pPr>
       <w:r>
         <w:rPr>
-          <w:b/>
-          <w:sz w:val="24"/>
-        </w:rPr>
-        <w:t xml:space="preserve">Backend: </w:t>
-      </w:r>
-      <w:r>
-        <w:rPr>
+          <w:rFonts w:ascii="Times New Roman" w:hAnsi="Times New Roman"/>
           <w:b w:val="0"/>
           <w:sz w:val="24"/>
         </w:rPr>
-        <w:t>Java 21 + Spring Boot em monólito modular Maven com 8 módulos e ~120 migrações Flyway (Hibernate em validate); JWT + 2FA por e-mail, criptografia AES-GCM de dados sensíveis em repouso, rate limiting próprio com trusted proxies e proteções anti-slowloris.</w:t>
+        <w:t>Plataforma de controle financeiro e análise de investimentos. Coleta automaticamente dados da bolsa e de órgãos oficiais (B3 e CVM), mantém um histórico com quase 9 milhões de cotações e ajuda a avaliar ações por cinco métodos diferentes. Tem login com verificação em duas etapas e criptografia dos dados sensíveis. Manter o sistema no ar me ensinou a diagnosticar e resolver problemas reais de servidor, como falta de memória e falhas silenciosas de componentes.</w:t>
       </w:r>
     </w:p>
     <w:p>
       <w:pPr>
-        <w:pStyle w:val="ListBullet"/>
-        <w:spacing w:line="360" w:lineRule="auto" w:after="40"/>
-        <w:ind w:left="425"/>
+        <w:keepNext/>
+        <w:widowControl/>
+        <w:spacing w:line="240" w:lineRule="auto" w:before="100" w:after="40"/>
+        <w:jc w:val="left"/>
+      </w:pPr>
+      <w:r>
+        <w:rPr>
+          <w:rFonts w:ascii="Times New Roman" w:hAnsi="Times New Roman"/>
+          <w:b/>
+          <w:sz w:val="24"/>
+        </w:rPr>
+        <w:t>Lingua: aprendizado de idiomas com repetição espaçada</w:t>
+      </w:r>
+    </w:p>
+    <w:p>
+      <w:pPr>
+        <w:keepNext w:val="0"/>
+        <w:widowControl/>
+        <w:spacing w:line="360" w:lineRule="auto" w:before="0" w:after="40"/>
         <w:jc w:val="both"/>
       </w:pPr>
       <w:r>
         <w:rPr>
-          <w:b/>
-          <w:sz w:val="24"/>
-        </w:rPr>
-        <w:t xml:space="preserve">Ingestão de mercado: </w:t>
-      </w:r>
-      <w:r>
-        <w:rPr>
+          <w:rFonts w:ascii="Times New Roman" w:hAnsi="Times New Roman"/>
           <w:b w:val="0"/>
           <w:sz w:val="24"/>
         </w:rPr>
-        <w:t>serviço Python (FastAPI) coletando B3, CVM e Yahoo Finance — cotações, proventos, demonstrativos e FIIs — numa base com 8,9 milhões de candles; throttling global e retry com backoff contra rate limit.</w:t>
+        <w:t>Aplicativo de estudo de idiomas que mostra cada palavra na hora certa de revisar, para o aluno não esquecer. Funciona no computador e no celular, com áudio gerado por voz sintética e reconhecimento de fala. Calibrei o método de revisão com simulações e testes rigorosos: a configuração final retém 81% do vocabulário após uma semana, contra 7% da pior configuração.</w:t>
       </w:r>
     </w:p>
     <w:p>
       <w:pPr>
-        <w:pStyle w:val="ListBullet"/>
-        <w:spacing w:line="360" w:lineRule="auto" w:after="40"/>
-        <w:ind w:left="425"/>
+        <w:keepNext/>
+        <w:widowControl/>
+        <w:spacing w:line="240" w:lineRule="auto" w:before="100" w:after="40"/>
+        <w:jc w:val="left"/>
+      </w:pPr>
+      <w:r>
+        <w:rPr>
+          <w:rFonts w:ascii="Times New Roman" w:hAnsi="Times New Roman"/>
+          <w:b/>
+          <w:sz w:val="24"/>
+        </w:rPr>
+        <w:t>Monitorame: logística de frotas, remessas, sensores e rotas</w:t>
+      </w:r>
+    </w:p>
+    <w:p>
+      <w:pPr>
+        <w:keepNext w:val="0"/>
+        <w:widowControl/>
+        <w:spacing w:line="360" w:lineRule="auto" w:before="0" w:after="40"/>
         <w:jc w:val="both"/>
       </w:pPr>
       <w:r>
         <w:rPr>
-          <w:b/>
-          <w:sz w:val="24"/>
-        </w:rPr>
-        <w:t xml:space="preserve">Análise: </w:t>
-      </w:r>
-      <w:r>
-        <w:rPr>
+          <w:rFonts w:ascii="Times New Roman" w:hAnsi="Times New Roman"/>
           <w:b w:val="0"/>
           <w:sz w:val="24"/>
         </w:rPr>
-        <w:t>aplicativo desktop nativo (PySide6 + pyqtgraph) em 4 camadas com enforcement por teste; 5 métodos de valuation, screener e score por percentil; autenticação delegada ao backend.</w:t>
+        <w:t>Sistema de logística para controlar frotas, entregas, sensores e rotas. Calcula o melhor caminho e a melhor ordem de paradas para os veículos e mostra tudo em mapas interativos. Cada alteração no código passa por uma bateria automática de testes, do banco de dados às telas, antes de ser publicada.</w:t>
       </w:r>
     </w:p>
     <w:p>
       <w:pPr>
-        <w:pStyle w:val="ListBullet"/>
-        <w:spacing w:line="360" w:lineRule="auto" w:after="40"/>
-        <w:ind w:left="425"/>
+        <w:keepNext/>
+        <w:widowControl/>
+        <w:spacing w:line="240" w:lineRule="auto" w:before="100" w:after="40"/>
+        <w:jc w:val="left"/>
+      </w:pPr>
+      <w:r>
+        <w:rPr>
+          <w:rFonts w:ascii="Times New Roman" w:hAnsi="Times New Roman"/>
+          <w:b/>
+          <w:sz w:val="24"/>
+        </w:rPr>
+        <w:t>Activity Manager: rastreio de tempo com classificação por IA (Linux)</w:t>
+      </w:r>
+    </w:p>
+    <w:p>
+      <w:pPr>
+        <w:keepNext w:val="0"/>
+        <w:widowControl/>
+        <w:spacing w:line="360" w:lineRule="auto" w:before="0" w:after="40"/>
         <w:jc w:val="both"/>
       </w:pPr>
       <w:r>
         <w:rPr>
-          <w:b/>
-          <w:sz w:val="24"/>
-        </w:rPr>
-        <w:t xml:space="preserve">Frontend: </w:t>
-      </w:r>
-      <w:r>
-        <w:rPr>
+          <w:rFonts w:ascii="Times New Roman" w:hAnsi="Times New Roman"/>
           <w:b w:val="0"/>
           <w:sz w:val="24"/>
         </w:rPr>
-        <w:t>Angular 21 + PrimeNG, i18n (pt/en/es), testes Vitest como gate de build, deploy Vercel.</w:t>
+        <w:t>Programa que registra em que o usuário gasta o tempo no computador e classifica as atividades automaticamente com IA. Foi desenhado para proteger a privacidade: a análise acontece no computador do próprio usuário e o servidor nunca vê o conteúdo das janelas.</w:t>
       </w:r>
     </w:p>
     <w:p>
       <w:pPr>
-        <w:pStyle w:val="ListBullet"/>
-        <w:spacing w:line="360" w:lineRule="auto" w:after="40"/>
-        <w:ind w:left="425"/>
-        <w:jc w:val="both"/>
-      </w:pPr>
-      <w:r>
-        <w:rPr>
-          <w:b/>
-          <w:sz w:val="24"/>
-        </w:rPr>
-        <w:t xml:space="preserve">Infra/CI: </w:t>
-      </w:r>
-      <w:r>
-        <w:rPr>
-          <w:b w:val="0"/>
-          <w:sz w:val="24"/>
-        </w:rPr>
-        <w:t>GitHub Actions → GHCR → Watchtower na VPS (deploy pull-based, o GitHub nunca acessa o servidor); Cloudflare Tunnel na borda; homologação real antes da produção.</w:t>
-      </w:r>
-    </w:p>
-    <w:p>
-      <w:pPr>
-        <w:pStyle w:val="ListBullet"/>
-        <w:spacing w:line="360" w:lineRule="auto" w:after="40"/>
-        <w:ind w:left="425"/>
-        <w:jc w:val="both"/>
-      </w:pPr>
-      <w:r>
-        <w:rPr>
-          <w:b/>
-          <w:sz w:val="24"/>
-        </w:rPr>
-        <w:t xml:space="preserve">Desafios resolvidos: </w:t>
-      </w:r>
-      <w:r>
-        <w:rPr>
-          <w:b w:val="0"/>
-          <w:sz w:val="24"/>
-        </w:rPr>
-        <w:t>OOMKill (exit 137) da JVM em VPS de 4 GB durante sincronização de preços, resolvido com limites de memória por container e ajuste de MaxRAMPercentage; dependência yfinance pinada após colunas virarem NULL silenciosamente; diagnóstico de loop de restart silencioso do Watchtower (incompatibilidade de Docker API) que interrompia deploys.</w:t>
-      </w:r>
-    </w:p>
-    <w:p>
-      <w:pPr>
-        <w:spacing w:before="200" w:after="40" w:line="240" w:lineRule="auto"/>
+        <w:keepNext/>
+        <w:widowControl/>
+        <w:spacing w:line="240" w:lineRule="auto" w:before="100" w:after="40"/>
         <w:jc w:val="left"/>
       </w:pPr>
       <w:r>
         <w:rPr>
-          <w:b/>
-          <w:sz w:val="24"/>
-        </w:rPr>
-        <w:t>Lingua — aprendizado de idiomas com repetição espaçada</w:t>
-      </w:r>
-    </w:p>
-    <w:p>
-      <w:pPr>
-        <w:pStyle w:val="ListBullet"/>
-        <w:spacing w:line="360" w:lineRule="auto" w:after="40"/>
-        <w:ind w:left="425"/>
-        <w:jc w:val="both"/>
-      </w:pPr>
-      <w:r>
-        <w:rPr>
-          <w:b w:val="0"/>
-          <w:sz w:val="24"/>
-        </w:rPr>
-        <w:t>Backend Java 21 + Spring Boot + PostgreSQL; clientes desktop (Electron/Wayland) e Android (Capacitor); síntese de voz (edge-tts) e reconhecimento de fala (Whisper) em CPU dentro do container.</w:t>
-      </w:r>
-    </w:p>
-    <w:p>
-      <w:pPr>
-        <w:pStyle w:val="ListBullet"/>
-        <w:spacing w:line="360" w:lineRule="auto" w:after="40"/>
-        <w:ind w:left="425"/>
-        <w:jc w:val="both"/>
-      </w:pPr>
-      <w:r>
-        <w:rPr>
-          <w:b/>
-          <w:sz w:val="24"/>
-        </w:rPr>
-        <w:t xml:space="preserve">Motor de repetição espaçada portado de JavaScript para Java </w:t>
-      </w:r>
-      <w:r>
-        <w:rPr>
-          <w:b w:val="0"/>
-          <w:sz w:val="24"/>
-        </w:rPr>
-        <w:t>com testes diferenciais (200 trajetórias comparadas bit a bit contra o motor original); parâmetros escolhidos por simulação de aluno sintético com ablação — retenção em 7 dias de 81% vs 7% na pior configuração.</w:t>
-      </w:r>
-    </w:p>
-    <w:p>
-      <w:pPr>
-        <w:pStyle w:val="ListBullet"/>
-        <w:spacing w:line="360" w:lineRule="auto" w:after="40"/>
-        <w:ind w:left="425"/>
-        <w:jc w:val="both"/>
-      </w:pPr>
-      <w:r>
-        <w:rPr>
-          <w:b w:val="0"/>
-          <w:sz w:val="24"/>
-        </w:rPr>
-        <w:t>Integração multi-provedor de IA no cliente (Anthropic, OpenAI, Gemini) com saída estruturada; busca de letras e metadados (LRCLIB, Deezer) com candidatas em paralelo usando threads virtuais.</w:t>
-      </w:r>
-    </w:p>
-    <w:p>
-      <w:pPr>
-        <w:pStyle w:val="ListBullet"/>
-        <w:spacing w:line="360" w:lineRule="auto" w:after="40"/>
-        <w:ind w:left="425"/>
-        <w:jc w:val="both"/>
-      </w:pPr>
-      <w:r>
-        <w:rPr>
-          <w:b/>
-          <w:sz w:val="24"/>
-        </w:rPr>
-        <w:t xml:space="preserve">Desafios resolvidos: </w:t>
-      </w:r>
-      <w:r>
-        <w:rPr>
-          <w:b w:val="0"/>
-          <w:sz w:val="24"/>
-        </w:rPr>
-        <w:t>falha silenciosa de permissão de uid em volume Docker transformada em erro de build com smoke tests na imagem; sincronização de milhares de áudios entre dispositivos via catálogo, manifesto e reconciliação.</w:t>
-      </w:r>
-    </w:p>
-    <w:p>
-      <w:pPr>
-        <w:spacing w:before="200" w:after="40" w:line="240" w:lineRule="auto"/>
-        <w:jc w:val="left"/>
-      </w:pPr>
-      <w:r>
-        <w:rPr>
-          <w:b/>
-          <w:sz w:val="24"/>
-        </w:rPr>
-        <w:t>Monitorame — logística: frotas, remessas, sensores e rotas</w:t>
-      </w:r>
-    </w:p>
-    <w:p>
-      <w:pPr>
-        <w:pStyle w:val="ListBullet"/>
-        <w:spacing w:line="360" w:lineRule="auto" w:after="40"/>
-        <w:ind w:left="425"/>
-        <w:jc w:val="both"/>
-      </w:pPr>
-      <w:r>
-        <w:rPr>
-          <w:b/>
-          <w:sz w:val="24"/>
-        </w:rPr>
-        <w:t xml:space="preserve">Monólito modular Spring Boot 3.5 com 15 módulos Maven </w:t>
-      </w:r>
-      <w:r>
-        <w:rPr>
-          <w:b w:val="0"/>
-          <w:sz w:val="24"/>
-        </w:rPr>
-        <w:t>e grafo de dependências acíclico; comunicação entre módulos por eventos de domínio Spring; soft delete em todos os recursos.</w:t>
-      </w:r>
-    </w:p>
-    <w:p>
-      <w:pPr>
-        <w:pStyle w:val="ListBullet"/>
-        <w:spacing w:line="360" w:lineRule="auto" w:after="40"/>
-        <w:ind w:left="425"/>
-        <w:jc w:val="both"/>
-      </w:pPr>
-      <w:r>
-        <w:rPr>
-          <w:b w:val="0"/>
-          <w:sz w:val="24"/>
-        </w:rPr>
-        <w:t>Roteirização com OSRM (matriz de distâncias + rotas), fallback determinístico haversine e otimização de paradas por vizinho-mais-próximo + 2-opt; frontend Angular 22 + Leaflet.</w:t>
-      </w:r>
-    </w:p>
-    <w:p>
-      <w:pPr>
-        <w:pStyle w:val="ListBullet"/>
-        <w:spacing w:line="360" w:lineRule="auto" w:after="40"/>
-        <w:ind w:left="425"/>
-        <w:jc w:val="both"/>
-      </w:pPr>
-      <w:r>
-        <w:rPr>
-          <w:b/>
-          <w:sz w:val="24"/>
-        </w:rPr>
-        <w:t xml:space="preserve">Qualidade: </w:t>
-      </w:r>
-      <w:r>
-        <w:rPr>
-          <w:b w:val="0"/>
-          <w:sz w:val="24"/>
-        </w:rPr>
-        <w:t>CI em 3 jobs — backend com Testcontainers (PostgreSQL real), frontend, e2e Playwright; compose em 3 estágios com healthchecks encadeados e Nginx como proxy de /api (elimina CORS e URL de API no bundle).</w:t>
-      </w:r>
-    </w:p>
-    <w:p>
-      <w:pPr>
-        <w:spacing w:before="200" w:after="40" w:line="240" w:lineRule="auto"/>
-        <w:jc w:val="left"/>
-      </w:pPr>
-      <w:r>
-        <w:rPr>
-          <w:b/>
-          <w:sz w:val="24"/>
-        </w:rPr>
-        <w:t>Activity Manager — rastreio de tempo com classificação por IA (Linux)</w:t>
-      </w:r>
-    </w:p>
-    <w:p>
-      <w:pPr>
-        <w:pStyle w:val="ListBullet"/>
-        <w:spacing w:line="360" w:lineRule="auto" w:after="40"/>
-        <w:ind w:left="425"/>
-        <w:jc w:val="both"/>
-      </w:pPr>
-      <w:r>
-        <w:rPr>
-          <w:b w:val="0"/>
-          <w:sz w:val="24"/>
-        </w:rPr>
-        <w:t>Electron integrado ao compositor Hyprland/Wayland (atalhos globais e coleta de janelas/ociosidade via socket de eventos); backend Spring Boot + PostgreSQL.</w:t>
-      </w:r>
-    </w:p>
-    <w:p>
-      <w:pPr>
-        <w:pStyle w:val="ListBullet"/>
-        <w:spacing w:line="360" w:lineRule="auto" w:after="40"/>
-        <w:ind w:left="425"/>
-        <w:jc w:val="both"/>
-      </w:pPr>
-      <w:r>
-        <w:rPr>
-          <w:b/>
-          <w:sz w:val="24"/>
-        </w:rPr>
-        <w:t xml:space="preserve">Classificação em 4 estágios </w:t>
-      </w:r>
-      <w:r>
-        <w:rPr>
-          <w:b w:val="0"/>
-          <w:sz w:val="24"/>
-        </w:rPr>
-        <w:t>(ocioso → regras → cache → fila de IA): o servidor enfileira tarefas e os dispositivos fazem polling de saída (funciona atrás de NAT), executando o modelo localmente (Ollama/Claude); categorias garantidas por enum no schema de saída estruturada; o servidor nunca vê títulos de janela — privacidade por arquitetura.</w:t>
-      </w:r>
-    </w:p>
-    <w:p>
-      <w:pPr>
-        <w:spacing w:before="200" w:after="40" w:line="240" w:lineRule="auto"/>
-        <w:jc w:val="left"/>
-      </w:pPr>
-      <w:r>
-        <w:rPr>
-          <w:b/>
-          <w:sz w:val="24"/>
-        </w:rPr>
-        <w:t>Educa — portal acadêmico multiperfil</w:t>
-      </w:r>
-    </w:p>
-    <w:p>
-      <w:pPr>
-        <w:spacing w:after="80"/>
-      </w:pPr>
-      <w:r>
-        <w:rPr>
-          <w:b w:val="0"/>
-          <w:sz w:val="24"/>
-        </w:rPr>
-        <w:t>Spring Boot 3.5 + PostgreSQL + Flyway; Angular 21 + PrimeNG + Tailwind; dashboards (Chart.js) para aluno, professor e instituição em 23 telas; JWT; 3 ambientes.</w:t>
-      </w:r>
-    </w:p>
-    <w:p>
-      <w:pPr>
-        <w:spacing w:before="200" w:after="40" w:line="240" w:lineRule="auto"/>
-        <w:jc w:val="left"/>
-      </w:pPr>
-      <w:r>
-        <w:rPr>
+          <w:rFonts w:ascii="Times New Roman" w:hAnsi="Times New Roman"/>
           <w:b/>
           <w:sz w:val="24"/>
         </w:rPr>
@@ -804,124 +580,30 @@
     </w:p>
     <w:p>
       <w:pPr>
-        <w:pStyle w:val="ListBullet"/>
-        <w:spacing w:line="360" w:lineRule="auto" w:after="40"/>
-        <w:ind w:left="425"/>
+        <w:keepNext w:val="0"/>
+        <w:widowControl/>
+        <w:spacing w:line="360" w:lineRule="auto" w:before="0" w:after="40"/>
         <w:jc w:val="both"/>
       </w:pPr>
       <w:r>
         <w:rPr>
-          <w:b/>
-          <w:sz w:val="24"/>
-        </w:rPr>
-        <w:t xml:space="preserve">mail-reader </w:t>
-      </w:r>
-      <w:r>
-        <w:rPr>
+          <w:rFonts w:ascii="Times New Roman" w:hAnsi="Times New Roman"/>
           <w:b w:val="0"/>
           <w:sz w:val="24"/>
         </w:rPr>
-        <w:t>— cliente de e-mail desktop (Electron) com Gmail API e Microsoft Graph via OAuth; tokens cifrados no chaveiro do SO.</w:t>
+        <w:t>Mantenho ainda: portal acadêmico com painéis para aluno, professor e instituição (23 telas); leitor de e-mails para computador (Gmail e Outlook); localizador familiar em mapa, hospedado por mim; extensão publicada na loja oficial do editor VS Code; e análise de dados públicos de saúde (DATASUS).</w:t>
       </w:r>
     </w:p>
     <w:p>
       <w:pPr>
-        <w:pStyle w:val="ListBullet"/>
-        <w:spacing w:line="360" w:lineRule="auto" w:after="40"/>
-        <w:ind w:left="425"/>
-        <w:jc w:val="both"/>
+        <w:keepNext/>
+        <w:widowControl/>
+        <w:spacing w:line="240" w:lineRule="auto" w:before="100" w:after="40"/>
+        <w:jc w:val="left"/>
       </w:pPr>
       <w:r>
         <w:rPr>
-          <w:b/>
-          <w:sz w:val="24"/>
-        </w:rPr>
-        <w:t xml:space="preserve">Farol </w:t>
-      </w:r>
-      <w:r>
-        <w:rPr>
-          <w:b w:val="0"/>
-          <w:sz w:val="24"/>
-        </w:rPr>
-        <w:t>— localização familiar self-hosted: Node/Express + Socket.IO + PostgreSQL/PostGIS (geofencing com ST_DWithin), PWA Leaflet, integração OwnTracks.</w:t>
-      </w:r>
-    </w:p>
-    <w:p>
-      <w:pPr>
-        <w:pStyle w:val="ListBullet"/>
-        <w:spacing w:line="360" w:lineRule="auto" w:after="40"/>
-        <w:ind w:left="425"/>
-        <w:jc w:val="both"/>
-      </w:pPr>
-      <w:r>
-        <w:rPr>
-          <w:b/>
-          <w:sz w:val="24"/>
-        </w:rPr>
-        <w:t xml:space="preserve">git-manager </w:t>
-      </w:r>
-      <w:r>
-        <w:rPr>
-          <w:b w:val="0"/>
-          <w:sz w:val="24"/>
-        </w:rPr>
-        <w:t>— cliente Git desktop (Electron + simple-git) com grafo de commits e staging visual.</w:t>
-      </w:r>
-    </w:p>
-    <w:p>
-      <w:pPr>
-        <w:pStyle w:val="ListBullet"/>
-        <w:spacing w:line="360" w:lineRule="auto" w:after="40"/>
-        <w:ind w:left="425"/>
-        <w:jc w:val="both"/>
-      </w:pPr>
-      <w:r>
-        <w:rPr>
-          <w:b/>
-          <w:sz w:val="24"/>
-        </w:rPr>
-        <w:t xml:space="preserve">terminal-animado </w:t>
-      </w:r>
-      <w:r>
-        <w:rPr>
-          <w:b w:val="0"/>
-          <w:sz w:val="24"/>
-        </w:rPr>
-        <w:t>— extensão VS Code publicada; animações otimizadas por medição real de CPU (62% → ~1% de núcleo movendo tudo para transform/opacity em GPU).</w:t>
-      </w:r>
-    </w:p>
-    <w:p>
-      <w:pPr>
-        <w:pStyle w:val="ListBullet"/>
-        <w:spacing w:line="360" w:lineRule="auto" w:after="40"/>
-        <w:ind w:left="425"/>
-        <w:jc w:val="both"/>
-      </w:pPr>
-      <w:r>
-        <w:rPr>
-          <w:b/>
-          <w:sz w:val="24"/>
-        </w:rPr>
-        <w:t xml:space="preserve">Observatório de saúde </w:t>
-      </w:r>
-      <w:r>
-        <w:rPr>
-          <w:b w:val="0"/>
-          <w:sz w:val="24"/>
-        </w:rPr>
-        <w:t>— pipeline de dados públicos DATASUS (SIM/SINASC/SIH/CNES): Python + DuckDB/Parquet, decodificação do formato .DBC e análises SQL epidemiológicas.</w:t>
-      </w:r>
-    </w:p>
-    <w:p>
-      <w:pPr>
-        <w:spacing w:before="280" w:after="80" w:line="240" w:lineRule="auto"/>
-        <w:jc w:val="left"/>
-        <w:pBdr>
-          <w:bottom w:val="single" w:sz="6" w:space="2" w:color="1D4ED8"/>
-        </w:pBdr>
-      </w:pPr>
-      <w:r>
-        <w:rPr>
+          <w:rFonts w:ascii="Times New Roman" w:hAnsi="Times New Roman"/>
           <w:b/>
           <w:color w:val="1D4ED8"/>
           <w:sz w:val="24"/>
@@ -931,190 +613,62 @@
     </w:p>
     <w:p>
       <w:pPr>
-        <w:pStyle w:val="ListBullet"/>
-        <w:spacing w:line="360" w:lineRule="auto" w:after="40"/>
-        <w:ind w:left="425"/>
+        <w:keepNext w:val="0"/>
+        <w:widowControl/>
+        <w:spacing w:line="360" w:lineRule="auto" w:before="0" w:after="40"/>
         <w:jc w:val="both"/>
       </w:pPr>
       <w:r>
         <w:rPr>
-          <w:b/>
-          <w:sz w:val="24"/>
-        </w:rPr>
-        <w:t xml:space="preserve">Linguagens: </w:t>
-      </w:r>
-      <w:r>
-        <w:rPr>
+          <w:rFonts w:ascii="Times New Roman" w:hAnsi="Times New Roman"/>
           <w:b w:val="0"/>
           <w:sz w:val="24"/>
         </w:rPr>
-        <w:t>Java (avançado) · TypeScript/JavaScript · Python · SQL · Go · Dart</w:t>
+        <w:t>Backend: Java (avançado) com Spring Boot 2/3, Spring Cloud (Gateway, Eureka, OpenFeign) e Spring Security (JWT, OAuth2); Python (FastAPI, Django REST); Node.js (Express, WebSockets); Go e Dart. Conceitos: microsserviços, monólitos modulares, eventos de domínio, mensageria (RabbitMQ) e processamento assíncrono, APIs REST, JPA/Hibernate.</w:t>
       </w:r>
     </w:p>
     <w:p>
       <w:pPr>
-        <w:pStyle w:val="ListBullet"/>
-        <w:spacing w:line="360" w:lineRule="auto" w:after="40"/>
-        <w:ind w:left="425"/>
+        <w:keepNext w:val="0"/>
+        <w:widowControl/>
+        <w:spacing w:line="360" w:lineRule="auto" w:before="0" w:after="40"/>
         <w:jc w:val="both"/>
       </w:pPr>
       <w:r>
         <w:rPr>
-          <w:b/>
-          <w:sz w:val="24"/>
-        </w:rPr>
-        <w:t xml:space="preserve">Backend: </w:t>
-      </w:r>
-      <w:r>
-        <w:rPr>
+          <w:rFonts w:ascii="Times New Roman" w:hAnsi="Times New Roman"/>
           <w:b w:val="0"/>
           <w:sz w:val="24"/>
         </w:rPr>
-        <w:t>Spring Boot 2/3 · Spring Cloud (Gateway, Eureka, OpenFeign) · Spring Security (JWT, OAuth2) · APIs REST · JPA/Hibernate · FastAPI · Django REST · Node/Express · Socket.IO/WebSocket</w:t>
+        <w:t>Frontend e dados: Angular 17–22 (PrimeNG, TailwindCSS, RxJS, SSR), Vue 3, Electron, Flutter e Capacitor; PostgreSQL (PostGIS), Oracle, SQL Server e DuckDB, com modelagem, otimização de consultas e migrações versionadas (Flyway).</w:t>
       </w:r>
     </w:p>
     <w:p>
       <w:pPr>
-        <w:pStyle w:val="ListBullet"/>
-        <w:spacing w:line="360" w:lineRule="auto" w:after="40"/>
-        <w:ind w:left="425"/>
+        <w:keepNext w:val="0"/>
+        <w:widowControl/>
+        <w:spacing w:line="360" w:lineRule="auto" w:before="0" w:after="40"/>
         <w:jc w:val="both"/>
       </w:pPr>
       <w:r>
         <w:rPr>
-          <w:b/>
-          <w:sz w:val="24"/>
-        </w:rPr>
-        <w:t xml:space="preserve">Mensageria &amp; assíncrono: </w:t>
-      </w:r>
-      <w:r>
-        <w:rPr>
+          <w:rFonts w:ascii="Times New Roman" w:hAnsi="Times New Roman"/>
           <w:b w:val="0"/>
           <w:sz w:val="24"/>
         </w:rPr>
-        <w:t>RabbitMQ · eventos de domínio Spring · filas de tarefas com polling · @Scheduled/cron · threads virtuais (Java 21)</w:t>
+        <w:t>Infraestrutura, qualidade e IA: Docker/Compose, GitHub Actions, Linux/VPS, Nginx, Cloudflare Tunnel e Prometheus; JUnit, Testcontainers, Playwright e Vitest; integração de LLMs (Anthropic, OpenAI, Gemini) com saída estruturada e RPA com Selenium.</w:t>
       </w:r>
     </w:p>
     <w:p>
       <w:pPr>
-        <w:pStyle w:val="ListBullet"/>
-        <w:spacing w:line="360" w:lineRule="auto" w:after="40"/>
-        <w:ind w:left="425"/>
-        <w:jc w:val="both"/>
+        <w:keepNext/>
+        <w:widowControl/>
+        <w:spacing w:line="240" w:lineRule="auto" w:before="100" w:after="40"/>
+        <w:jc w:val="left"/>
       </w:pPr>
       <w:r>
         <w:rPr>
-          <w:b/>
-          <w:sz w:val="24"/>
-        </w:rPr>
-        <w:t xml:space="preserve">Frontend: </w:t>
-      </w:r>
-      <w:r>
-        <w:rPr>
-          <w:b w:val="0"/>
-          <w:sz w:val="24"/>
-        </w:rPr>
-        <w:t>Angular 17–22 (PrimeNG, TailwindCSS, RxJS, SSR) · Vue 3 · Electron · Flutter · Capacitor</w:t>
-      </w:r>
-    </w:p>
-    <w:p>
-      <w:pPr>
-        <w:pStyle w:val="ListBullet"/>
-        <w:spacing w:line="360" w:lineRule="auto" w:after="40"/>
-        <w:ind w:left="425"/>
-        <w:jc w:val="both"/>
-      </w:pPr>
-      <w:r>
-        <w:rPr>
-          <w:b/>
-          <w:sz w:val="24"/>
-        </w:rPr>
-        <w:t xml:space="preserve">Bancos de dados: </w:t>
-      </w:r>
-      <w:r>
-        <w:rPr>
-          <w:b w:val="0"/>
-          <w:sz w:val="24"/>
-        </w:rPr>
-        <w:t>PostgreSQL (+ PostGIS) · Oracle · SQL Server · modelagem e otimização de queries · Flyway · DuckDB/Parquet</w:t>
-      </w:r>
-    </w:p>
-    <w:p>
-      <w:pPr>
-        <w:pStyle w:val="ListBullet"/>
-        <w:spacing w:line="360" w:lineRule="auto" w:after="40"/>
-        <w:ind w:left="425"/>
-        <w:jc w:val="both"/>
-      </w:pPr>
-      <w:r>
-        <w:rPr>
-          <w:b/>
-          <w:sz w:val="24"/>
-        </w:rPr>
-        <w:t xml:space="preserve">DevOps &amp; Infra: </w:t>
-      </w:r>
-      <w:r>
-        <w:rPr>
-          <w:b w:val="0"/>
-          <w:sz w:val="24"/>
-        </w:rPr>
-        <w:t>Docker/Compose · GitHub Actions · GHCR · Watchtower · Cloudflare Tunnel · Nginx · Linux/VPS · Vercel · Azure Static Web Apps · Prometheus/Actuator</w:t>
-      </w:r>
-    </w:p>
-    <w:p>
-      <w:pPr>
-        <w:pStyle w:val="ListBullet"/>
-        <w:spacing w:line="360" w:lineRule="auto" w:after="40"/>
-        <w:ind w:left="425"/>
-        <w:jc w:val="both"/>
-      </w:pPr>
-      <w:r>
-        <w:rPr>
-          <w:b/>
-          <w:sz w:val="24"/>
-        </w:rPr>
-        <w:t xml:space="preserve">Testes: </w:t>
-      </w:r>
-      <w:r>
-        <w:rPr>
-          <w:b w:val="0"/>
-          <w:sz w:val="24"/>
-        </w:rPr>
-        <w:t>JUnit · Testcontainers · Playwright (e2e) · Vitest · testes diferenciais e de carga</w:t>
-      </w:r>
-    </w:p>
-    <w:p>
-      <w:pPr>
-        <w:pStyle w:val="ListBullet"/>
-        <w:spacing w:line="360" w:lineRule="auto" w:after="40"/>
-        <w:ind w:left="425"/>
-        <w:jc w:val="both"/>
-      </w:pPr>
-      <w:r>
-        <w:rPr>
-          <w:b/>
-          <w:sz w:val="24"/>
-        </w:rPr>
-        <w:t xml:space="preserve">IA aplicada: </w:t>
-      </w:r>
-      <w:r>
-        <w:rPr>
-          <w:b w:val="0"/>
-          <w:sz w:val="24"/>
-        </w:rPr>
-        <w:t>integração de LLMs (Anthropic, OpenAI, Gemini) com saída estruturada · RPA (Selenium) · IA como par de programação (Claude, KIMI)</w:t>
-      </w:r>
-    </w:p>
-    <w:p>
-      <w:pPr>
-        <w:spacing w:before="280" w:after="80" w:line="240" w:lineRule="auto"/>
-        <w:jc w:val="left"/>
-        <w:pBdr>
-          <w:bottom w:val="single" w:sz="6" w:space="2" w:color="1D4ED8"/>
-        </w:pBdr>
-      </w:pPr>
-      <w:r>
-        <w:rPr>
+          <w:rFonts w:ascii="Times New Roman" w:hAnsi="Times New Roman"/>
           <w:b/>
           <w:color w:val="1D4ED8"/>
           <w:sz w:val="24"/>
@@ -1124,33 +678,30 @@
     </w:p>
     <w:p>
       <w:pPr>
-        <w:spacing w:after="80"/>
+        <w:keepNext w:val="0"/>
+        <w:widowControl/>
+        <w:spacing w:line="360" w:lineRule="auto" w:before="0" w:after="40"/>
+        <w:jc w:val="both"/>
       </w:pPr>
       <w:r>
         <w:rPr>
-          <w:b/>
-          <w:sz w:val="24"/>
-        </w:rPr>
-        <w:t xml:space="preserve">Engenharia da Computação </w:t>
-      </w:r>
-      <w:r>
-        <w:rPr>
+          <w:rFonts w:ascii="Times New Roman" w:hAnsi="Times New Roman"/>
           <w:b w:val="0"/>
           <w:sz w:val="24"/>
         </w:rPr>
-        <w:t>— Escola de Engenharia de Piracicaba (EEP) · previsão de conclusão: 12/2026 (período noturno).</w:t>
+        <w:t>Engenharia da Computação · Escola de Engenharia de Piracicaba (EEP) · previsão de conclusão: 12/2026 (período noturno).</w:t>
       </w:r>
     </w:p>
     <w:p>
       <w:pPr>
-        <w:spacing w:before="280" w:after="80" w:line="240" w:lineRule="auto"/>
+        <w:keepNext/>
+        <w:widowControl/>
+        <w:spacing w:line="240" w:lineRule="auto" w:before="100" w:after="40"/>
         <w:jc w:val="left"/>
-        <w:pBdr>
-          <w:bottom w:val="single" w:sz="6" w:space="2" w:color="1D4ED8"/>
-        </w:pBdr>
       </w:pPr>
       <w:r>
         <w:rPr>
+          <w:rFonts w:ascii="Times New Roman" w:hAnsi="Times New Roman"/>
           <w:b/>
           <w:color w:val="1D4ED8"/>
           <w:sz w:val="24"/>
@@ -1160,39 +711,22 @@
     </w:p>
     <w:p>
       <w:pPr>
-        <w:spacing w:after="80"/>
+        <w:keepNext w:val="0"/>
+        <w:widowControl/>
+        <w:spacing w:line="360" w:lineRule="auto" w:before="0" w:after="40"/>
+        <w:jc w:val="both"/>
       </w:pPr>
       <w:r>
         <w:rPr>
-          <w:b/>
-          <w:sz w:val="24"/>
-        </w:rPr>
-        <w:t xml:space="preserve">Português </w:t>
-      </w:r>
-      <w:r>
-        <w:rPr>
+          <w:rFonts w:ascii="Times New Roman" w:hAnsi="Times New Roman"/>
           <w:b w:val="0"/>
           <w:sz w:val="24"/>
         </w:rPr>
-        <w:t xml:space="preserve">— nativo.   </w:t>
-      </w:r>
-      <w:r>
-        <w:rPr>
-          <w:b/>
-          <w:sz w:val="24"/>
-        </w:rPr>
-        <w:t xml:space="preserve">Inglês </w:t>
-      </w:r>
-      <w:r>
-        <w:rPr>
-          <w:b w:val="0"/>
-          <w:sz w:val="24"/>
-        </w:rPr>
-        <w:t>— avançado (Red Balloon, Cultura Inglesa e Wise Up; vivência em viagens aos EUA).</w:t>
+        <w:t>Português nativo. Inglês avançado (Red Balloon, Cultura Inglesa e Wise Up).</w:t>
       </w:r>
     </w:p>
     <w:sectPr>
-      <w:pgSz w:w="11906" w:h="16838"/>
+      <w:pgSz w:w="12240" w:h="15840"/>
       <w:pgMar w:top="1701" w:right="1134" w:bottom="1134" w:left="1701" w:header="720" w:footer="720" w:gutter="0"/>
       <w:cols w:space="720"/>
       <w:docGrid w:linePitch="360"/>
@@ -1564,10 +1098,6 @@
     <w:name w:val="Normal"/>
     <w:qFormat/>
     <w:rsid w:val="00FC693F"/>
-    <w:pPr>
-      <w:spacing w:line="360" w:lineRule="auto" w:after="0"/>
-      <w:jc w:val="both"/>
-    </w:pPr>
     <w:rPr>
       <w:rFonts w:ascii="Times New Roman" w:hAnsi="Times New Roman"/>
       <w:sz w:val="24"/>

</xml_diff>